<commit_message>
dieu chinh don vi
</commit_message>
<xml_diff>
--- a/data/raw/new_task/tài liệu cập nhật chatbox AI.docx
+++ b/data/raw/new_task/tài liệu cập nhật chatbox AI.docx
@@ -519,7 +519,25 @@
           <w:szCs w:val="28"/>
           <w:lang w:val="vi-VN"/>
         </w:rPr>
-        <w:t>6. Thiếu tá Nguyễn Thế Lam – Phó Trưởng Công an xã: Phụ trách Tổ Khu vực: 0983.137.968</w:t>
+        <w:t>6. Thiếu tá Nguyễn Thế Lam – Phó Trưởng Công an xã: Phụ trách Tổ</w:t>
+      </w:r>
+      <w:r>
+        <w:rPr>
+          <w:rFonts w:ascii="Times New Roman" w:hAnsi="Times New Roman" w:cs="Times New Roman"/>
+          <w:sz w:val="28"/>
+          <w:szCs w:val="28"/>
+          <w:lang w:val="vi-VN"/>
+        </w:rPr>
+        <w:t xml:space="preserve"> Cảnh sát</w:t>
+      </w:r>
+      <w:r>
+        <w:rPr>
+          <w:rFonts w:ascii="Times New Roman" w:hAnsi="Times New Roman" w:cs="Times New Roman"/>
+          <w:sz w:val="28"/>
+          <w:szCs w:val="28"/>
+          <w:lang w:val="vi-VN"/>
+        </w:rPr>
+        <w:t xml:space="preserve"> Khu vực: 0983.137.968</w:t>
       </w:r>
     </w:p>
     <w:p>
@@ -686,6 +704,7 @@
           <w:rFonts w:ascii="Times New Roman" w:hAnsi="Times New Roman" w:cs="Times New Roman"/>
           <w:sz w:val="28"/>
           <w:szCs w:val="28"/>
+          <w:lang w:val="vi-VN"/>
         </w:rPr>
         <w:t>0918.550.798</w:t>
       </w:r>
@@ -1022,13 +1041,15 @@
           <w:rFonts w:ascii="Times New Roman" w:hAnsi="Times New Roman" w:cs="Times New Roman"/>
           <w:sz w:val="28"/>
           <w:szCs w:val="28"/>
-        </w:rPr>
-      </w:pPr>
-      <w:r>
-        <w:rPr>
-          <w:rFonts w:ascii="Times New Roman" w:hAnsi="Times New Roman" w:cs="Times New Roman"/>
-          <w:sz w:val="28"/>
-          <w:szCs w:val="28"/>
+          <w:lang w:val="vi-VN"/>
+        </w:rPr>
+      </w:pPr>
+      <w:r>
+        <w:rPr>
+          <w:rFonts w:ascii="Times New Roman" w:hAnsi="Times New Roman" w:cs="Times New Roman"/>
+          <w:sz w:val="28"/>
+          <w:szCs w:val="28"/>
+          <w:lang w:val="vi-VN"/>
         </w:rPr>
         <w:t>Công dân được tuyển chọn thực hiện nghĩa vụ tham gia Công an nhân dân phải bảo đảm tiêu chuẩn sức khỏe theo quy định của Bộ Công an và Bộ Y tế, cụ thể:</w:t>
       </w:r>
@@ -1042,13 +1063,15 @@
           <w:rFonts w:ascii="Times New Roman" w:hAnsi="Times New Roman" w:cs="Times New Roman"/>
           <w:sz w:val="28"/>
           <w:szCs w:val="28"/>
-        </w:rPr>
-      </w:pPr>
-      <w:r>
-        <w:rPr>
-          <w:rFonts w:ascii="Times New Roman" w:hAnsi="Times New Roman" w:cs="Times New Roman"/>
-          <w:sz w:val="28"/>
-          <w:szCs w:val="28"/>
+          <w:lang w:val="vi-VN"/>
+        </w:rPr>
+      </w:pPr>
+      <w:r>
+        <w:rPr>
+          <w:rFonts w:ascii="Times New Roman" w:hAnsi="Times New Roman" w:cs="Times New Roman"/>
+          <w:sz w:val="28"/>
+          <w:szCs w:val="28"/>
+          <w:lang w:val="vi-VN"/>
         </w:rPr>
         <w:t xml:space="preserve">Có </w:t>
       </w:r>
@@ -1059,6 +1082,7 @@
           <w:bCs/>
           <w:sz w:val="28"/>
           <w:szCs w:val="28"/>
+          <w:lang w:val="vi-VN"/>
         </w:rPr>
         <w:t>thể lực tốt</w:t>
       </w:r>
@@ -1067,6 +1091,7 @@
           <w:rFonts w:ascii="Times New Roman" w:hAnsi="Times New Roman" w:cs="Times New Roman"/>
           <w:sz w:val="28"/>
           <w:szCs w:val="28"/>
+          <w:lang w:val="vi-VN"/>
         </w:rPr>
         <w:t xml:space="preserve">, không mắc các bệnh mãn tính, bệnh truyền nhiễm hoặc các bệnh thuộc diện không đủ điều kiện phục vụ </w:t>
       </w:r>
@@ -1080,13 +1105,15 @@
           <w:rFonts w:ascii="Times New Roman" w:hAnsi="Times New Roman" w:cs="Times New Roman"/>
           <w:sz w:val="28"/>
           <w:szCs w:val="28"/>
-        </w:rPr>
-      </w:pPr>
-      <w:r>
-        <w:rPr>
-          <w:rFonts w:ascii="Times New Roman" w:hAnsi="Times New Roman" w:cs="Times New Roman"/>
-          <w:sz w:val="28"/>
-          <w:szCs w:val="28"/>
+          <w:lang w:val="vi-VN"/>
+        </w:rPr>
+      </w:pPr>
+      <w:r>
+        <w:rPr>
+          <w:rFonts w:ascii="Times New Roman" w:hAnsi="Times New Roman" w:cs="Times New Roman"/>
+          <w:sz w:val="28"/>
+          <w:szCs w:val="28"/>
+          <w:lang w:val="vi-VN"/>
         </w:rPr>
         <w:t xml:space="preserve">Được </w:t>
       </w:r>
@@ -1097,6 +1124,7 @@
           <w:bCs/>
           <w:sz w:val="28"/>
           <w:szCs w:val="28"/>
+          <w:lang w:val="vi-VN"/>
         </w:rPr>
         <w:t>phân loại sức khỏe loại 1, loại 2 hoặc loại 3</w:t>
       </w:r>
@@ -1105,6 +1133,7 @@
           <w:rFonts w:ascii="Times New Roman" w:hAnsi="Times New Roman" w:cs="Times New Roman"/>
           <w:sz w:val="28"/>
           <w:szCs w:val="28"/>
+          <w:lang w:val="vi-VN"/>
         </w:rPr>
         <w:t xml:space="preserve"> theo quy định về khám sức khỏe tuyển chọn công dân thực hiện nghĩa vụ tham gia Công an nhân dân. </w:t>
       </w:r>
@@ -1118,15 +1147,17 @@
           <w:rFonts w:ascii="Times New Roman" w:hAnsi="Times New Roman" w:cs="Times New Roman"/>
           <w:sz w:val="28"/>
           <w:szCs w:val="28"/>
-        </w:rPr>
-      </w:pPr>
-      <w:r>
-        <w:rPr>
-          <w:rFonts w:ascii="Times New Roman" w:hAnsi="Times New Roman" w:cs="Times New Roman"/>
-          <w:b/>
-          <w:bCs/>
-          <w:sz w:val="28"/>
-          <w:szCs w:val="28"/>
+          <w:lang w:val="vi-VN"/>
+        </w:rPr>
+      </w:pPr>
+      <w:r>
+        <w:rPr>
+          <w:rFonts w:ascii="Times New Roman" w:hAnsi="Times New Roman" w:cs="Times New Roman"/>
+          <w:b/>
+          <w:bCs/>
+          <w:sz w:val="28"/>
+          <w:szCs w:val="28"/>
+          <w:lang w:val="vi-VN"/>
         </w:rPr>
         <w:t>Chiều cao, cân nặng</w:t>
       </w:r>
@@ -1135,6 +1166,7 @@
           <w:rFonts w:ascii="Times New Roman" w:hAnsi="Times New Roman" w:cs="Times New Roman"/>
           <w:sz w:val="28"/>
           <w:szCs w:val="28"/>
+          <w:lang w:val="vi-VN"/>
         </w:rPr>
         <w:t xml:space="preserve">: </w:t>
       </w:r>
@@ -1148,6 +1180,7 @@
           <w:rFonts w:ascii="Times New Roman" w:hAnsi="Times New Roman" w:cs="Times New Roman"/>
           <w:sz w:val="28"/>
           <w:szCs w:val="28"/>
+          <w:lang w:val="vi-VN"/>
         </w:rPr>
       </w:pPr>
       <w:r>
@@ -1168,6 +1201,7 @@
           <w:bCs/>
           <w:sz w:val="28"/>
           <w:szCs w:val="28"/>
+          <w:lang w:val="vi-VN"/>
         </w:rPr>
         <w:t>Nam:</w:t>
       </w:r>
@@ -1176,6 +1210,7 @@
           <w:rFonts w:ascii="Times New Roman" w:hAnsi="Times New Roman" w:cs="Times New Roman"/>
           <w:sz w:val="28"/>
           <w:szCs w:val="28"/>
+          <w:lang w:val="vi-VN"/>
         </w:rPr>
         <w:t xml:space="preserve"> cao từ </w:t>
       </w:r>
@@ -1186,6 +1221,7 @@
           <w:bCs/>
           <w:sz w:val="28"/>
           <w:szCs w:val="28"/>
+          <w:lang w:val="vi-VN"/>
         </w:rPr>
         <w:t>1,64 m trở lên</w:t>
       </w:r>
@@ -1194,6 +1230,7 @@
           <w:rFonts w:ascii="Times New Roman" w:hAnsi="Times New Roman" w:cs="Times New Roman"/>
           <w:sz w:val="28"/>
           <w:szCs w:val="28"/>
+          <w:lang w:val="vi-VN"/>
         </w:rPr>
         <w:t xml:space="preserve">, nặng từ </w:t>
       </w:r>
@@ -1204,6 +1241,7 @@
           <w:bCs/>
           <w:sz w:val="28"/>
           <w:szCs w:val="28"/>
+          <w:lang w:val="vi-VN"/>
         </w:rPr>
         <w:t>47 kg trở lên</w:t>
       </w:r>
@@ -1212,6 +1250,7 @@
           <w:rFonts w:ascii="Times New Roman" w:hAnsi="Times New Roman" w:cs="Times New Roman"/>
           <w:sz w:val="28"/>
           <w:szCs w:val="28"/>
+          <w:lang w:val="vi-VN"/>
         </w:rPr>
         <w:t xml:space="preserve">. </w:t>
       </w:r>
@@ -1225,6 +1264,7 @@
           <w:rFonts w:ascii="Times New Roman" w:hAnsi="Times New Roman" w:cs="Times New Roman"/>
           <w:sz w:val="28"/>
           <w:szCs w:val="28"/>
+          <w:lang w:val="vi-VN"/>
         </w:rPr>
       </w:pPr>
       <w:r>
@@ -1256,6 +1296,7 @@
           <w:bCs/>
           <w:sz w:val="28"/>
           <w:szCs w:val="28"/>
+          <w:lang w:val="vi-VN"/>
         </w:rPr>
         <w:t>Nữ (nếu được tuyển chọn):</w:t>
       </w:r>
@@ -1264,6 +1305,7 @@
           <w:rFonts w:ascii="Times New Roman" w:hAnsi="Times New Roman" w:cs="Times New Roman"/>
           <w:sz w:val="28"/>
           <w:szCs w:val="28"/>
+          <w:lang w:val="vi-VN"/>
         </w:rPr>
         <w:t xml:space="preserve"> cao từ </w:t>
       </w:r>
@@ -1274,6 +1316,7 @@
           <w:bCs/>
           <w:sz w:val="28"/>
           <w:szCs w:val="28"/>
+          <w:lang w:val="vi-VN"/>
         </w:rPr>
         <w:t>1,58 m trở lên</w:t>
       </w:r>
@@ -1282,6 +1325,7 @@
           <w:rFonts w:ascii="Times New Roman" w:hAnsi="Times New Roman" w:cs="Times New Roman"/>
           <w:sz w:val="28"/>
           <w:szCs w:val="28"/>
+          <w:lang w:val="vi-VN"/>
         </w:rPr>
         <w:t xml:space="preserve">, nặng từ </w:t>
       </w:r>
@@ -1292,6 +1336,7 @@
           <w:bCs/>
           <w:sz w:val="28"/>
           <w:szCs w:val="28"/>
+          <w:lang w:val="vi-VN"/>
         </w:rPr>
         <w:t>45 kg trở lên</w:t>
       </w:r>
@@ -1300,6 +1345,7 @@
           <w:rFonts w:ascii="Times New Roman" w:hAnsi="Times New Roman" w:cs="Times New Roman"/>
           <w:sz w:val="28"/>
           <w:szCs w:val="28"/>
+          <w:lang w:val="vi-VN"/>
         </w:rPr>
         <w:t xml:space="preserve">. </w:t>
       </w:r>
@@ -1313,15 +1359,17 @@
           <w:rFonts w:ascii="Times New Roman" w:hAnsi="Times New Roman" w:cs="Times New Roman"/>
           <w:sz w:val="28"/>
           <w:szCs w:val="28"/>
-        </w:rPr>
-      </w:pPr>
-      <w:r>
-        <w:rPr>
-          <w:rFonts w:ascii="Times New Roman" w:hAnsi="Times New Roman" w:cs="Times New Roman"/>
-          <w:b/>
-          <w:bCs/>
-          <w:sz w:val="28"/>
-          <w:szCs w:val="28"/>
+          <w:lang w:val="vi-VN"/>
+        </w:rPr>
+      </w:pPr>
+      <w:r>
+        <w:rPr>
+          <w:rFonts w:ascii="Times New Roman" w:hAnsi="Times New Roman" w:cs="Times New Roman"/>
+          <w:b/>
+          <w:bCs/>
+          <w:sz w:val="28"/>
+          <w:szCs w:val="28"/>
+          <w:lang w:val="vi-VN"/>
         </w:rPr>
         <w:t>Thị lực:</w:t>
       </w:r>
@@ -1330,6 +1378,7 @@
           <w:rFonts w:ascii="Times New Roman" w:hAnsi="Times New Roman" w:cs="Times New Roman"/>
           <w:sz w:val="28"/>
           <w:szCs w:val="28"/>
+          <w:lang w:val="vi-VN"/>
         </w:rPr>
         <w:t xml:space="preserve"> </w:t>
       </w:r>
@@ -1343,6 +1392,7 @@
           <w:rFonts w:ascii="Times New Roman" w:hAnsi="Times New Roman" w:cs="Times New Roman"/>
           <w:sz w:val="28"/>
           <w:szCs w:val="28"/>
+          <w:lang w:val="vi-VN"/>
         </w:rPr>
       </w:pPr>
       <w:r>
@@ -1359,6 +1409,7 @@
           <w:rFonts w:ascii="Times New Roman" w:hAnsi="Times New Roman" w:cs="Times New Roman"/>
           <w:sz w:val="28"/>
           <w:szCs w:val="28"/>
+          <w:lang w:val="vi-VN"/>
         </w:rPr>
         <w:t xml:space="preserve">Không mắc các bệnh về mắt ảnh hưởng đến khả năng </w:t>
       </w:r>
@@ -1372,6 +1423,7 @@
           <w:rFonts w:ascii="Times New Roman" w:hAnsi="Times New Roman" w:cs="Times New Roman"/>
           <w:sz w:val="28"/>
           <w:szCs w:val="28"/>
+          <w:lang w:val="vi-VN"/>
         </w:rPr>
       </w:pPr>
       <w:r>
@@ -1388,6 +1440,7 @@
           <w:rFonts w:ascii="Times New Roman" w:hAnsi="Times New Roman" w:cs="Times New Roman"/>
           <w:sz w:val="28"/>
           <w:szCs w:val="28"/>
+          <w:lang w:val="vi-VN"/>
         </w:rPr>
         <w:t xml:space="preserve">Được tuyển chọn đối với công dân có </w:t>
       </w:r>
@@ -1398,6 +1451,7 @@
           <w:bCs/>
           <w:sz w:val="28"/>
           <w:szCs w:val="28"/>
+          <w:lang w:val="vi-VN"/>
         </w:rPr>
         <w:t>tật khúc xạ không quá 03 đi-ốp</w:t>
       </w:r>
@@ -1406,6 +1460,7 @@
           <w:rFonts w:ascii="Times New Roman" w:hAnsi="Times New Roman" w:cs="Times New Roman"/>
           <w:sz w:val="28"/>
           <w:szCs w:val="28"/>
+          <w:lang w:val="vi-VN"/>
         </w:rPr>
         <w:t xml:space="preserve">; nếu bị cận thị phải cam kết điều trị trước khi nhập ngũ theo quy định. </w:t>
       </w:r>
@@ -1419,6 +1474,7 @@
           <w:rFonts w:ascii="Times New Roman" w:hAnsi="Times New Roman" w:cs="Times New Roman"/>
           <w:sz w:val="28"/>
           <w:szCs w:val="28"/>
+          <w:lang w:val="vi-VN"/>
         </w:rPr>
       </w:pPr>
       <w:r>
@@ -1435,6 +1491,7 @@
           <w:rFonts w:ascii="Times New Roman" w:hAnsi="Times New Roman" w:cs="Times New Roman"/>
           <w:sz w:val="28"/>
           <w:szCs w:val="28"/>
+          <w:lang w:val="vi-VN"/>
         </w:rPr>
         <w:t xml:space="preserve">Không nghiện ma túy, không sử dụng trái phép chất ma túy; không mắc các rối loạn tâm thần hoặc các bệnh ảnh hưởng đến khả năng nhận thức, điều khiển hành vi. </w:t>
       </w:r>
@@ -1448,6 +1505,7 @@
           <w:rFonts w:ascii="Times New Roman" w:hAnsi="Times New Roman" w:cs="Times New Roman"/>
           <w:sz w:val="28"/>
           <w:szCs w:val="28"/>
+          <w:lang w:val="vi-VN"/>
         </w:rPr>
       </w:pPr>
       <w:r>
@@ -1465,6 +1523,7 @@
           <w:rFonts w:ascii="Times New Roman" w:hAnsi="Times New Roman" w:cs="Times New Roman"/>
           <w:sz w:val="28"/>
           <w:szCs w:val="28"/>
+          <w:lang w:val="vi-VN"/>
         </w:rPr>
         <w:t xml:space="preserve">Không có dị tật, dị dạng ảnh hưởng đến khả năng thực hiện nhiệm vụ của chiến </w:t>
       </w:r>
@@ -1473,6 +1532,7 @@
           <w:rFonts w:ascii="Times New Roman" w:hAnsi="Times New Roman" w:cs="Times New Roman"/>
           <w:sz w:val="28"/>
           <w:szCs w:val="28"/>
+          <w:lang w:val="vi-VN"/>
         </w:rPr>
         <w:t>sỹ</w:t>
       </w:r>
@@ -1481,6 +1541,7 @@
           <w:rFonts w:ascii="Times New Roman" w:hAnsi="Times New Roman" w:cs="Times New Roman"/>
           <w:sz w:val="28"/>
           <w:szCs w:val="28"/>
+          <w:lang w:val="vi-VN"/>
         </w:rPr>
         <w:t xml:space="preserve"> Công an nhân dân. </w:t>
       </w:r>
@@ -1496,15 +1557,17 @@
           <w:bCs/>
           <w:sz w:val="28"/>
           <w:szCs w:val="28"/>
-        </w:rPr>
-      </w:pPr>
-      <w:r>
-        <w:rPr>
-          <w:rFonts w:ascii="Times New Roman" w:hAnsi="Times New Roman" w:cs="Times New Roman"/>
-          <w:b/>
-          <w:bCs/>
-          <w:sz w:val="28"/>
-          <w:szCs w:val="28"/>
+          <w:lang w:val="vi-VN"/>
+        </w:rPr>
+      </w:pPr>
+      <w:r>
+        <w:rPr>
+          <w:rFonts w:ascii="Times New Roman" w:hAnsi="Times New Roman" w:cs="Times New Roman"/>
+          <w:b/>
+          <w:bCs/>
+          <w:sz w:val="28"/>
+          <w:szCs w:val="28"/>
+          <w:lang w:val="vi-VN"/>
         </w:rPr>
         <w:t>Một số trường hợp không đủ điều kiện về sức khỏe</w:t>
       </w:r>
@@ -1518,13 +1581,15 @@
           <w:rFonts w:ascii="Times New Roman" w:hAnsi="Times New Roman" w:cs="Times New Roman"/>
           <w:sz w:val="28"/>
           <w:szCs w:val="28"/>
-        </w:rPr>
-      </w:pPr>
-      <w:r>
-        <w:rPr>
-          <w:rFonts w:ascii="Times New Roman" w:hAnsi="Times New Roman" w:cs="Times New Roman"/>
-          <w:sz w:val="28"/>
-          <w:szCs w:val="28"/>
+          <w:lang w:val="vi-VN"/>
+        </w:rPr>
+      </w:pPr>
+      <w:r>
+        <w:rPr>
+          <w:rFonts w:ascii="Times New Roman" w:hAnsi="Times New Roman" w:cs="Times New Roman"/>
+          <w:sz w:val="28"/>
+          <w:szCs w:val="28"/>
+          <w:lang w:val="vi-VN"/>
         </w:rPr>
         <w:t>Công dân sẽ không đủ điều kiện tuyển chọn nếu thuộc một trong các trường hợp như:</w:t>
       </w:r>
@@ -1538,6 +1603,7 @@
           <w:rFonts w:ascii="Times New Roman" w:hAnsi="Times New Roman" w:cs="Times New Roman"/>
           <w:sz w:val="28"/>
           <w:szCs w:val="28"/>
+          <w:lang w:val="vi-VN"/>
         </w:rPr>
       </w:pPr>
       <w:r>
@@ -1554,6 +1620,7 @@
           <w:rFonts w:ascii="Times New Roman" w:hAnsi="Times New Roman" w:cs="Times New Roman"/>
           <w:sz w:val="28"/>
           <w:szCs w:val="28"/>
+          <w:lang w:val="vi-VN"/>
         </w:rPr>
         <w:t xml:space="preserve">Mắc bệnh tim mạch, hô hấp, thần kinh, động kinh hoặc các bệnh mạn tính nặng. </w:t>
       </w:r>
@@ -1567,6 +1634,7 @@
           <w:rFonts w:ascii="Times New Roman" w:hAnsi="Times New Roman" w:cs="Times New Roman"/>
           <w:sz w:val="28"/>
           <w:szCs w:val="28"/>
+          <w:lang w:val="vi-VN"/>
         </w:rPr>
       </w:pPr>
       <w:r>
@@ -1583,6 +1651,7 @@
           <w:rFonts w:ascii="Times New Roman" w:hAnsi="Times New Roman" w:cs="Times New Roman"/>
           <w:sz w:val="28"/>
           <w:szCs w:val="28"/>
+          <w:lang w:val="vi-VN"/>
         </w:rPr>
         <w:t xml:space="preserve">Mắc bệnh truyền nhiễm theo quy định của Bộ Y tế. </w:t>
       </w:r>
@@ -1596,6 +1665,7 @@
           <w:rFonts w:ascii="Times New Roman" w:hAnsi="Times New Roman" w:cs="Times New Roman"/>
           <w:sz w:val="28"/>
           <w:szCs w:val="28"/>
+          <w:lang w:val="vi-VN"/>
         </w:rPr>
       </w:pPr>
       <w:r>
@@ -1612,6 +1682,7 @@
           <w:rFonts w:ascii="Times New Roman" w:hAnsi="Times New Roman" w:cs="Times New Roman"/>
           <w:sz w:val="28"/>
           <w:szCs w:val="28"/>
+          <w:lang w:val="vi-VN"/>
         </w:rPr>
         <w:t xml:space="preserve">Có dị tật, khuyết tật làm hạn chế khả năng học tập, huấn luyện và thực hiện nhiệm vụ trong lực lượng Công an nhân dân. </w:t>
       </w:r>
@@ -1625,6 +1696,7 @@
           <w:rFonts w:ascii="Times New Roman" w:hAnsi="Times New Roman" w:cs="Times New Roman"/>
           <w:sz w:val="28"/>
           <w:szCs w:val="28"/>
+          <w:lang w:val="vi-VN"/>
         </w:rPr>
       </w:pPr>
       <w:r>
@@ -1641,6 +1713,7 @@
           <w:rFonts w:ascii="Times New Roman" w:hAnsi="Times New Roman" w:cs="Times New Roman"/>
           <w:sz w:val="28"/>
           <w:szCs w:val="28"/>
+          <w:lang w:val="vi-VN"/>
         </w:rPr>
         <w:t xml:space="preserve">Không đạt tiêu chuẩn về thể lực hoặc bị phân loại sức khỏe từ </w:t>
       </w:r>
@@ -1651,6 +1724,7 @@
           <w:bCs/>
           <w:sz w:val="28"/>
           <w:szCs w:val="28"/>
+          <w:lang w:val="vi-VN"/>
         </w:rPr>
         <w:t>loại 4 trở xuống</w:t>
       </w:r>
@@ -1659,6 +1733,7 @@
           <w:rFonts w:ascii="Times New Roman" w:hAnsi="Times New Roman" w:cs="Times New Roman"/>
           <w:sz w:val="28"/>
           <w:szCs w:val="28"/>
+          <w:lang w:val="vi-VN"/>
         </w:rPr>
         <w:t xml:space="preserve">. </w:t>
       </w:r>
@@ -1680,6 +1755,7 @@
           <w:rFonts w:ascii="Times New Roman" w:hAnsi="Times New Roman" w:cs="Times New Roman"/>
           <w:sz w:val="28"/>
           <w:szCs w:val="28"/>
+          <w:lang w:val="vi-VN"/>
         </w:rPr>
         <w:t>Việc khám sức khỏe được tổ chức theo đúng quy trình của Hội đồng khám sức khỏe và kết luận của cơ sở y tế có thẩm quyền là căn cứ để xem xét tuyển chọn công dân thực hiện nghĩa vụ tham gia Công an nhân dân</w:t>
       </w:r>
@@ -1876,6 +1952,7 @@
           <w:iCs/>
           <w:sz w:val="28"/>
           <w:szCs w:val="28"/>
+          <w:lang w:val="vi-VN"/>
         </w:rPr>
         <w:t>Thời gian</w:t>
       </w:r>
@@ -1899,6 +1976,7 @@
           <w:rFonts w:ascii="Times New Roman" w:hAnsi="Times New Roman" w:cs="Times New Roman"/>
           <w:sz w:val="28"/>
           <w:szCs w:val="28"/>
+          <w:lang w:val="vi-VN"/>
         </w:rPr>
         <w:t xml:space="preserve">Thời hạn thực hiện nghĩa vụ tham gia CAND là </w:t>
       </w:r>
@@ -1909,6 +1987,7 @@
           <w:bCs/>
           <w:sz w:val="28"/>
           <w:szCs w:val="28"/>
+          <w:lang w:val="vi-VN"/>
         </w:rPr>
         <w:t>24 tháng.</w:t>
       </w:r>
@@ -1948,13 +2027,15 @@
           <w:rFonts w:ascii="Times New Roman" w:hAnsi="Times New Roman" w:cs="Times New Roman"/>
           <w:sz w:val="28"/>
           <w:szCs w:val="28"/>
-        </w:rPr>
-      </w:pPr>
-      <w:r>
-        <w:rPr>
-          <w:rFonts w:ascii="Times New Roman" w:hAnsi="Times New Roman" w:cs="Times New Roman"/>
-          <w:sz w:val="28"/>
-          <w:szCs w:val="28"/>
+          <w:lang w:val="vi-VN"/>
+        </w:rPr>
+      </w:pPr>
+      <w:r>
+        <w:rPr>
+          <w:rFonts w:ascii="Times New Roman" w:hAnsi="Times New Roman" w:cs="Times New Roman"/>
+          <w:sz w:val="28"/>
+          <w:szCs w:val="28"/>
+          <w:lang w:val="vi-VN"/>
         </w:rPr>
         <w:t>Công dân thực hiện nghĩa vụ tham gia Công an nhân dân được hưởng đầy đủ các chế độ, chính sách theo quy định của Luật Nghĩa vụ quân sự, các nghị định của Chính phủ và quy định của Bộ Công an.</w:t>
       </w:r>
@@ -1968,48 +2049,18 @@
           <w:rFonts w:ascii="Times New Roman" w:hAnsi="Times New Roman" w:cs="Times New Roman"/>
           <w:sz w:val="28"/>
           <w:szCs w:val="28"/>
-        </w:rPr>
-      </w:pPr>
-      <w:r>
-        <w:rPr>
-          <w:rFonts w:ascii="Times New Roman" w:hAnsi="Times New Roman" w:cs="Times New Roman"/>
-          <w:sz w:val="28"/>
-          <w:szCs w:val="28"/>
+          <w:lang w:val="vi-VN"/>
+        </w:rPr>
+      </w:pPr>
+      <w:r>
+        <w:rPr>
+          <w:rFonts w:ascii="Times New Roman" w:hAnsi="Times New Roman" w:cs="Times New Roman"/>
+          <w:sz w:val="28"/>
+          <w:szCs w:val="28"/>
+          <w:lang w:val="vi-VN"/>
         </w:rPr>
         <w:lastRenderedPageBreak/>
-        <w:t xml:space="preserve">Trong thời gian phục vụ tại ngũ, hạ </w:t>
-      </w:r>
-      <w:r>
-        <w:rPr>
-          <w:rFonts w:ascii="Times New Roman" w:hAnsi="Times New Roman" w:cs="Times New Roman"/>
-          <w:sz w:val="28"/>
-          <w:szCs w:val="28"/>
-        </w:rPr>
-        <w:t>sỹ</w:t>
-      </w:r>
-      <w:r>
-        <w:rPr>
-          <w:rFonts w:ascii="Times New Roman" w:hAnsi="Times New Roman" w:cs="Times New Roman"/>
-          <w:sz w:val="28"/>
-          <w:szCs w:val="28"/>
-        </w:rPr>
-        <w:t xml:space="preserve"> quan, chiến </w:t>
-      </w:r>
-      <w:r>
-        <w:rPr>
-          <w:rFonts w:ascii="Times New Roman" w:hAnsi="Times New Roman" w:cs="Times New Roman"/>
-          <w:sz w:val="28"/>
-          <w:szCs w:val="28"/>
-        </w:rPr>
-        <w:t>sỹ</w:t>
-      </w:r>
-      <w:r>
-        <w:rPr>
-          <w:rFonts w:ascii="Times New Roman" w:hAnsi="Times New Roman" w:cs="Times New Roman"/>
-          <w:sz w:val="28"/>
-          <w:szCs w:val="28"/>
-        </w:rPr>
-        <w:t xml:space="preserve"> nghĩa vụ được Nhà nước bảo đảm đầy đủ các điều kiện phục vụ, cụ thể:</w:t>
+        <w:t>Trong thời gian phục vụ tại ngũ, hạ sỹ quan, chiến sỹ nghĩa vụ được Nhà nước bảo đảm đầy đủ các điều kiện phục vụ, cụ thể:</w:t>
       </w:r>
     </w:p>
     <w:p>
@@ -2021,6 +2072,7 @@
           <w:rFonts w:ascii="Times New Roman" w:hAnsi="Times New Roman" w:cs="Times New Roman"/>
           <w:sz w:val="28"/>
           <w:szCs w:val="28"/>
+          <w:lang w:val="vi-VN"/>
         </w:rPr>
       </w:pPr>
       <w:r>
@@ -2037,6 +2089,7 @@
           <w:rFonts w:ascii="Times New Roman" w:hAnsi="Times New Roman" w:cs="Times New Roman"/>
           <w:sz w:val="28"/>
           <w:szCs w:val="28"/>
+          <w:lang w:val="vi-VN"/>
         </w:rPr>
         <w:t>Được bảo đảm đầy đủ lương thực, thực phẩm, quân trang, nơi ăn, ở, sinh hoạt và các trang bị cần thiết phục vụ công tác, huấn luyện.</w:t>
       </w:r>
@@ -2050,6 +2103,7 @@
           <w:rFonts w:ascii="Times New Roman" w:hAnsi="Times New Roman" w:cs="Times New Roman"/>
           <w:sz w:val="28"/>
           <w:szCs w:val="28"/>
+          <w:lang w:val="vi-VN"/>
         </w:rPr>
       </w:pPr>
       <w:r>
@@ -2066,6 +2120,7 @@
           <w:rFonts w:ascii="Times New Roman" w:hAnsi="Times New Roman" w:cs="Times New Roman"/>
           <w:sz w:val="28"/>
           <w:szCs w:val="28"/>
+          <w:lang w:val="vi-VN"/>
         </w:rPr>
         <w:t>Được hưởng phụ cấp quân hàm, phụ cấp hằng tháng và các chế độ khác theo quy định của pháp luật.</w:t>
       </w:r>
@@ -2079,6 +2134,7 @@
           <w:rFonts w:ascii="Times New Roman" w:hAnsi="Times New Roman" w:cs="Times New Roman"/>
           <w:sz w:val="28"/>
           <w:szCs w:val="28"/>
+          <w:lang w:val="vi-VN"/>
         </w:rPr>
       </w:pPr>
       <w:r>
@@ -2095,6 +2151,7 @@
           <w:rFonts w:ascii="Times New Roman" w:hAnsi="Times New Roman" w:cs="Times New Roman"/>
           <w:sz w:val="28"/>
           <w:szCs w:val="28"/>
+          <w:lang w:val="vi-VN"/>
         </w:rPr>
         <w:t>Được chăm sóc, khám và điều trị sức khỏe; được cấp thuốc phòng bệnh, chữa bệnh; được bảo đảm chế độ khi bị ốm đau, tai nạn, thương tích trong quá trình công tác.</w:t>
       </w:r>
@@ -2108,6 +2165,7 @@
           <w:rFonts w:ascii="Times New Roman" w:hAnsi="Times New Roman" w:cs="Times New Roman"/>
           <w:sz w:val="28"/>
           <w:szCs w:val="28"/>
+          <w:lang w:val="vi-VN"/>
         </w:rPr>
       </w:pPr>
       <w:r>
@@ -2124,6 +2182,7 @@
           <w:rFonts w:ascii="Times New Roman" w:hAnsi="Times New Roman" w:cs="Times New Roman"/>
           <w:sz w:val="28"/>
           <w:szCs w:val="28"/>
+          <w:lang w:val="vi-VN"/>
         </w:rPr>
         <w:t>Được tham gia bảo hiểm y tế, bảo hiểm xã hội theo quy định.</w:t>
       </w:r>
@@ -2154,6 +2213,7 @@
           <w:rFonts w:ascii="Times New Roman" w:hAnsi="Times New Roman" w:cs="Times New Roman"/>
           <w:sz w:val="28"/>
           <w:szCs w:val="28"/>
+          <w:lang w:val="vi-VN"/>
         </w:rPr>
         <w:t>Được huấn luyện về chính trị, pháp luật, điều lệnh, quân sự, võ thuật, nghiệp vụ Công an nhân dân và các kỹ năng cần thiết để thực hiện nhiệm vụ.</w:t>
       </w:r>
@@ -2176,6 +2236,7 @@
           <w:rFonts w:ascii="Times New Roman" w:hAnsi="Times New Roman" w:cs="Times New Roman"/>
           <w:sz w:val="28"/>
           <w:szCs w:val="28"/>
+          <w:lang w:val="vi-VN"/>
         </w:rPr>
       </w:pPr>
       <w:r>
@@ -2192,6 +2253,7 @@
           <w:rFonts w:ascii="Times New Roman" w:hAnsi="Times New Roman" w:cs="Times New Roman"/>
           <w:sz w:val="28"/>
           <w:szCs w:val="28"/>
+          <w:lang w:val="vi-VN"/>
         </w:rPr>
         <w:t>Được bố trí, phân công công tác phù hợp với yêu cầu nhiệm vụ và năng lực của từng cá nhân.</w:t>
       </w:r>
@@ -2205,47 +2267,17 @@
           <w:rFonts w:ascii="Times New Roman" w:hAnsi="Times New Roman" w:cs="Times New Roman"/>
           <w:sz w:val="28"/>
           <w:szCs w:val="28"/>
-        </w:rPr>
-      </w:pPr>
-      <w:r>
-        <w:rPr>
-          <w:rFonts w:ascii="Times New Roman" w:hAnsi="Times New Roman" w:cs="Times New Roman"/>
-          <w:sz w:val="28"/>
-          <w:szCs w:val="28"/>
-        </w:rPr>
-        <w:t xml:space="preserve">Sau khi hoàn thành thời hạn thực hiện nghĩa vụ tham gia Công an nhân dân, hạ </w:t>
-      </w:r>
-      <w:r>
-        <w:rPr>
-          <w:rFonts w:ascii="Times New Roman" w:hAnsi="Times New Roman" w:cs="Times New Roman"/>
-          <w:sz w:val="28"/>
-          <w:szCs w:val="28"/>
-        </w:rPr>
-        <w:t>sỹ</w:t>
-      </w:r>
-      <w:r>
-        <w:rPr>
-          <w:rFonts w:ascii="Times New Roman" w:hAnsi="Times New Roman" w:cs="Times New Roman"/>
-          <w:sz w:val="28"/>
-          <w:szCs w:val="28"/>
-        </w:rPr>
-        <w:t xml:space="preserve"> quan, chiến </w:t>
-      </w:r>
-      <w:r>
-        <w:rPr>
-          <w:rFonts w:ascii="Times New Roman" w:hAnsi="Times New Roman" w:cs="Times New Roman"/>
-          <w:sz w:val="28"/>
-          <w:szCs w:val="28"/>
-        </w:rPr>
-        <w:t>sỹ</w:t>
-      </w:r>
-      <w:r>
-        <w:rPr>
-          <w:rFonts w:ascii="Times New Roman" w:hAnsi="Times New Roman" w:cs="Times New Roman"/>
-          <w:sz w:val="28"/>
-          <w:szCs w:val="28"/>
-        </w:rPr>
-        <w:t xml:space="preserve"> nghĩa vụ được hưởng các chế độ, chính sách xuất ngũ theo quy định, bao gồm:</w:t>
+          <w:lang w:val="vi-VN"/>
+        </w:rPr>
+      </w:pPr>
+      <w:r>
+        <w:rPr>
+          <w:rFonts w:ascii="Times New Roman" w:hAnsi="Times New Roman" w:cs="Times New Roman"/>
+          <w:sz w:val="28"/>
+          <w:szCs w:val="28"/>
+          <w:lang w:val="vi-VN"/>
+        </w:rPr>
+        <w:t>Sau khi hoàn thành thời hạn thực hiện nghĩa vụ tham gia Công an nhân dân, hạ sỹ quan, chiến sỹ nghĩa vụ được hưởng các chế độ, chính sách xuất ngũ theo quy định, bao gồm:</w:t>
       </w:r>
     </w:p>
     <w:p>
@@ -2257,6 +2289,7 @@
           <w:rFonts w:ascii="Times New Roman" w:hAnsi="Times New Roman" w:cs="Times New Roman"/>
           <w:sz w:val="28"/>
           <w:szCs w:val="28"/>
+          <w:lang w:val="vi-VN"/>
         </w:rPr>
       </w:pPr>
       <w:r>
@@ -2273,6 +2306,7 @@
           <w:rFonts w:ascii="Times New Roman" w:hAnsi="Times New Roman" w:cs="Times New Roman"/>
           <w:sz w:val="28"/>
           <w:szCs w:val="28"/>
+          <w:lang w:val="vi-VN"/>
         </w:rPr>
         <w:t>Được cấp tiền tàu xe, phụ cấp xuất ngũ và các khoản trợ cấp theo quy định của Nhà nước.</w:t>
       </w:r>
@@ -2303,6 +2337,7 @@
           <w:rFonts w:ascii="Times New Roman" w:hAnsi="Times New Roman" w:cs="Times New Roman"/>
           <w:sz w:val="28"/>
           <w:szCs w:val="28"/>
+          <w:lang w:val="vi-VN"/>
         </w:rPr>
         <w:t>Được hỗ trợ học nghề, tư vấn, giới thiệu việc làm sau khi xuất ngũ.</w:t>
       </w:r>
@@ -2325,6 +2360,7 @@
           <w:rFonts w:ascii="Times New Roman" w:hAnsi="Times New Roman" w:cs="Times New Roman"/>
           <w:sz w:val="28"/>
           <w:szCs w:val="28"/>
+          <w:lang w:val="vi-VN"/>
         </w:rPr>
       </w:pPr>
       <w:r>
@@ -2341,6 +2377,7 @@
           <w:rFonts w:ascii="Times New Roman" w:hAnsi="Times New Roman" w:cs="Times New Roman"/>
           <w:sz w:val="28"/>
           <w:szCs w:val="28"/>
+          <w:lang w:val="vi-VN"/>
         </w:rPr>
         <w:t>Thời gian thực hiện nghĩa vụ được tính vào thời gian công tác để xem xét hưởng một số chế độ theo quy định của pháp luật.</w:t>
       </w:r>
@@ -2354,6 +2391,7 @@
           <w:rFonts w:ascii="Times New Roman" w:hAnsi="Times New Roman" w:cs="Times New Roman"/>
           <w:sz w:val="28"/>
           <w:szCs w:val="28"/>
+          <w:lang w:val="vi-VN"/>
         </w:rPr>
       </w:pPr>
       <w:r>
@@ -2370,6 +2408,7 @@
           <w:rFonts w:ascii="Times New Roman" w:hAnsi="Times New Roman" w:cs="Times New Roman"/>
           <w:sz w:val="28"/>
           <w:szCs w:val="28"/>
+          <w:lang w:val="vi-VN"/>
         </w:rPr>
         <w:t>Trường hợp có đủ tiêu chuẩn, phẩm chất, năng lực, đáp ứng yêu cầu của Bộ Công an thì được xem xét tuyển chọn chuyển sang phục vụ theo chế độ chuyên nghiệp trong lực lượng Công an nhân dân.</w:t>
       </w:r>
@@ -2395,6 +2434,7 @@
           <w:bCs/>
           <w:sz w:val="28"/>
           <w:szCs w:val="28"/>
+          <w:lang w:val="vi-VN"/>
         </w:rPr>
         <w:t>Hồ sơ tuyển chọn</w:t>
       </w:r>
@@ -2416,6 +2456,7 @@
           <w:rFonts w:ascii="Times New Roman" w:hAnsi="Times New Roman" w:cs="Times New Roman"/>
           <w:sz w:val="28"/>
           <w:szCs w:val="28"/>
+          <w:lang w:val="vi-VN"/>
         </w:rPr>
         <w:t>Công dân có hộ khẩu thường trú dự tuyển vào thực hiện nghĩa vụ tham gia CAND nộp cho Công an xã các giấy tờ sau:</w:t>
       </w:r>
@@ -2437,6 +2478,7 @@
           <w:rFonts w:ascii="Times New Roman" w:hAnsi="Times New Roman" w:cs="Times New Roman"/>
           <w:sz w:val="28"/>
           <w:szCs w:val="28"/>
+          <w:lang w:val="vi-VN"/>
         </w:rPr>
         <w:t>- Tờ khai đăng ký thực hiện nghĩa vụ tham gia CAND theo mẫu Phụ lục ban hành kèm theo Nghị định số 184/2025/NĐ-CP ngày 01/7/2025 của Chính phủ có xác nhận của UBND xã, phường, đặc khu nơi cư trú hoặc của cơ quan, tổ chức nơi người đó đang công tác, học tập.</w:t>
       </w:r>
@@ -2458,6 +2500,7 @@
           <w:rFonts w:ascii="Times New Roman" w:hAnsi="Times New Roman" w:cs="Times New Roman"/>
           <w:sz w:val="28"/>
           <w:szCs w:val="28"/>
+          <w:lang w:val="vi-VN"/>
         </w:rPr>
         <w:t>- Giấy chứng nhận đăng ký nghĩa vụ quân sự.</w:t>
       </w:r>
@@ -2479,6 +2522,7 @@
           <w:rFonts w:ascii="Times New Roman" w:hAnsi="Times New Roman" w:cs="Times New Roman"/>
           <w:sz w:val="28"/>
           <w:szCs w:val="28"/>
+          <w:lang w:val="vi-VN"/>
         </w:rPr>
         <w:lastRenderedPageBreak/>
         <w:t>Ngoài những hồ sơ nêu trên, công dân nộp bổ sung một số loại giấy tờ sau:</w:t>
@@ -2503,6 +2547,7 @@
           <w:rFonts w:ascii="Times New Roman" w:hAnsi="Times New Roman" w:cs="Times New Roman"/>
           <w:sz w:val="28"/>
           <w:szCs w:val="28"/>
+          <w:lang w:val="vi-VN"/>
         </w:rPr>
         <w:t xml:space="preserve">- Bản sao: Giấy khai sinh, các văn bằng, chứng chỉ về trình độ học vấn do cơ quan nhà nước có thẩm quyền cấp </w:t>
       </w:r>
@@ -2513,6 +2558,7 @@
           <w:iCs/>
           <w:sz w:val="28"/>
           <w:szCs w:val="28"/>
+          <w:lang w:val="vi-VN"/>
         </w:rPr>
         <w:t>(bản sao có chứng thực, đã thẩm tra, xác minh theo quy định);</w:t>
       </w:r>
@@ -2534,6 +2580,7 @@
           <w:rFonts w:ascii="Times New Roman" w:hAnsi="Times New Roman" w:cs="Times New Roman"/>
           <w:sz w:val="28"/>
           <w:szCs w:val="28"/>
+          <w:lang w:val="vi-VN"/>
         </w:rPr>
         <w:t xml:space="preserve">- Giấy chứng nhận đoàn viên, đảng viên </w:t>
       </w:r>
@@ -2544,6 +2591,7 @@
           <w:iCs/>
           <w:sz w:val="28"/>
           <w:szCs w:val="28"/>
+          <w:lang w:val="vi-VN"/>
         </w:rPr>
         <w:t>(nếu là đoàn viên, đảng viên);</w:t>
       </w:r>
@@ -2565,6 +2613,7 @@
           <w:rFonts w:ascii="Times New Roman" w:hAnsi="Times New Roman" w:cs="Times New Roman"/>
           <w:sz w:val="28"/>
           <w:szCs w:val="28"/>
+          <w:lang w:val="vi-VN"/>
         </w:rPr>
         <w:t>- Bằng tốt nghiệp THPT;</w:t>
       </w:r>
@@ -2586,6 +2635,7 @@
           <w:rFonts w:ascii="Times New Roman" w:hAnsi="Times New Roman" w:cs="Times New Roman"/>
           <w:sz w:val="28"/>
           <w:szCs w:val="28"/>
+          <w:lang w:val="vi-VN"/>
         </w:rPr>
         <w:t>- Học bạ THPT;</w:t>
       </w:r>
@@ -2607,6 +2657,7 @@
           <w:rFonts w:ascii="Times New Roman" w:hAnsi="Times New Roman" w:cs="Times New Roman"/>
           <w:sz w:val="28"/>
           <w:szCs w:val="28"/>
+          <w:lang w:val="vi-VN"/>
         </w:rPr>
         <w:t xml:space="preserve">- Bản sao Căn cước công dân </w:t>
       </w:r>
@@ -2617,6 +2668,7 @@
           <w:iCs/>
           <w:sz w:val="28"/>
           <w:szCs w:val="28"/>
+          <w:lang w:val="vi-VN"/>
         </w:rPr>
         <w:t>(có chứng thực);</w:t>
       </w:r>
@@ -2638,6 +2690,7 @@
           <w:rFonts w:ascii="Times New Roman" w:hAnsi="Times New Roman" w:cs="Times New Roman"/>
           <w:sz w:val="28"/>
           <w:szCs w:val="28"/>
+          <w:lang w:val="vi-VN"/>
         </w:rPr>
         <w:t>- 04 ảnh (3x4).</w:t>
       </w:r>
@@ -2701,6 +2754,7 @@
           <w:bCs/>
           <w:sz w:val="28"/>
           <w:szCs w:val="28"/>
+          <w:lang w:val="vi-VN"/>
         </w:rPr>
       </w:pPr>
       <w:r>
@@ -2721,6 +2775,7 @@
           <w:bCs/>
           <w:sz w:val="28"/>
           <w:szCs w:val="28"/>
+          <w:lang w:val="vi-VN"/>
         </w:rPr>
         <w:t>Đối tượng</w:t>
       </w:r>
@@ -2734,15 +2789,17 @@
           <w:bCs/>
           <w:sz w:val="28"/>
           <w:szCs w:val="28"/>
-        </w:rPr>
-      </w:pPr>
-      <w:r>
-        <w:rPr>
-          <w:rFonts w:ascii="Times New Roman" w:hAnsi="Times New Roman" w:cs="Times New Roman"/>
-          <w:b/>
-          <w:bCs/>
-          <w:sz w:val="28"/>
-          <w:szCs w:val="28"/>
+          <w:lang w:val="vi-VN"/>
+        </w:rPr>
+      </w:pPr>
+      <w:r>
+        <w:rPr>
+          <w:rFonts w:ascii="Times New Roman" w:hAnsi="Times New Roman" w:cs="Times New Roman"/>
+          <w:b/>
+          <w:bCs/>
+          <w:sz w:val="28"/>
+          <w:szCs w:val="28"/>
+          <w:lang w:val="vi-VN"/>
         </w:rPr>
         <w:tab/>
         <w:t xml:space="preserve">- </w:t>
@@ -2753,6 +2810,7 @@
           <w:bCs/>
           <w:sz w:val="28"/>
           <w:szCs w:val="28"/>
+          <w:lang w:val="vi-VN"/>
         </w:rPr>
         <w:t xml:space="preserve">Công dân hoàn thành nghĩa vụ tham gia CAND có quyết định xuất ngũ trong vòng 12 tháng tính đến tháng dự tuyển. </w:t>
       </w:r>
@@ -2765,13 +2823,15 @@
           <w:rFonts w:ascii="Times New Roman" w:hAnsi="Times New Roman" w:cs="Times New Roman"/>
           <w:sz w:val="28"/>
           <w:szCs w:val="28"/>
-        </w:rPr>
-      </w:pPr>
-      <w:r>
-        <w:rPr>
-          <w:rFonts w:ascii="Times New Roman" w:hAnsi="Times New Roman" w:cs="Times New Roman"/>
-          <w:sz w:val="28"/>
-          <w:szCs w:val="28"/>
+          <w:lang w:val="vi-VN"/>
+        </w:rPr>
+      </w:pPr>
+      <w:r>
+        <w:rPr>
+          <w:rFonts w:ascii="Times New Roman" w:hAnsi="Times New Roman" w:cs="Times New Roman"/>
+          <w:sz w:val="28"/>
+          <w:szCs w:val="28"/>
+          <w:lang w:val="vi-VN"/>
         </w:rPr>
         <w:tab/>
         <w:t>- Công dân thường trú trên địa bàn xã An Viễn, thành</w:t>
@@ -2790,6 +2850,7 @@
           <w:rFonts w:ascii="Times New Roman" w:hAnsi="Times New Roman" w:cs="Times New Roman"/>
           <w:sz w:val="28"/>
           <w:szCs w:val="28"/>
+          <w:lang w:val="vi-VN"/>
         </w:rPr>
         <w:t xml:space="preserve"> Đồng Nai (độ tuổi không quá 22 tuổi, người dân tộc thiểu số không quá 25 tuổi)</w:t>
       </w:r>
@@ -2803,13 +2864,15 @@
           <w:b/>
           <w:sz w:val="28"/>
           <w:szCs w:val="28"/>
-        </w:rPr>
-      </w:pPr>
-      <w:r>
-        <w:rPr>
-          <w:rFonts w:ascii="Times New Roman" w:hAnsi="Times New Roman" w:cs="Times New Roman"/>
-          <w:sz w:val="28"/>
-          <w:szCs w:val="28"/>
+          <w:lang w:val="vi-VN"/>
+        </w:rPr>
+      </w:pPr>
+      <w:r>
+        <w:rPr>
+          <w:rFonts w:ascii="Times New Roman" w:hAnsi="Times New Roman" w:cs="Times New Roman"/>
+          <w:sz w:val="28"/>
+          <w:szCs w:val="28"/>
+          <w:lang w:val="vi-VN"/>
         </w:rPr>
         <w:tab/>
       </w:r>
@@ -2819,6 +2882,7 @@
           <w:b/>
           <w:sz w:val="28"/>
           <w:szCs w:val="28"/>
+          <w:lang w:val="vi-VN"/>
         </w:rPr>
         <w:t>2. Các loại hình đào tạo và Trường tuyển sinh</w:t>
       </w:r>
@@ -2832,14 +2896,16 @@
           <w:bCs/>
           <w:sz w:val="28"/>
           <w:szCs w:val="28"/>
-        </w:rPr>
-      </w:pPr>
-      <w:r>
-        <w:rPr>
-          <w:rFonts w:ascii="Times New Roman" w:hAnsi="Times New Roman" w:cs="Times New Roman"/>
-          <w:bCs/>
-          <w:sz w:val="28"/>
-          <w:szCs w:val="28"/>
+          <w:lang w:val="vi-VN"/>
+        </w:rPr>
+      </w:pPr>
+      <w:r>
+        <w:rPr>
+          <w:rFonts w:ascii="Times New Roman" w:hAnsi="Times New Roman" w:cs="Times New Roman"/>
+          <w:bCs/>
+          <w:sz w:val="28"/>
+          <w:szCs w:val="28"/>
+          <w:lang w:val="vi-VN"/>
         </w:rPr>
         <w:tab/>
         <w:t>- Đại học chính quy tuyển mới: Gồm các học viện, trường CAND khu vực phía Nam (T04, T05) và các trường tuyển sinh toàn quốc (T01,T03,T07, B06)</w:t>
@@ -2854,14 +2920,16 @@
           <w:bCs/>
           <w:sz w:val="28"/>
           <w:szCs w:val="28"/>
-        </w:rPr>
-      </w:pPr>
-      <w:r>
-        <w:rPr>
-          <w:rFonts w:ascii="Times New Roman" w:hAnsi="Times New Roman" w:cs="Times New Roman"/>
-          <w:bCs/>
-          <w:sz w:val="28"/>
-          <w:szCs w:val="28"/>
+          <w:lang w:val="vi-VN"/>
+        </w:rPr>
+      </w:pPr>
+      <w:r>
+        <w:rPr>
+          <w:rFonts w:ascii="Times New Roman" w:hAnsi="Times New Roman" w:cs="Times New Roman"/>
+          <w:bCs/>
+          <w:sz w:val="28"/>
+          <w:szCs w:val="28"/>
+          <w:lang w:val="vi-VN"/>
         </w:rPr>
         <w:tab/>
         <w:t>- Đại học Văn bằng 2 (VB2CA): Tuyển mới công dân đã có bằng tốt nghiệp  đại học trở lên dự tuyển vào các ngành nghiệp vụ An ninh, Cảnh sát,</w:t>
@@ -2882,6 +2950,7 @@
           <w:bCs/>
           <w:sz w:val="28"/>
           <w:szCs w:val="28"/>
+          <w:lang w:val="vi-VN"/>
         </w:rPr>
         <w:t>PCCC&amp;CNCH, an toàn thông tin….</w:t>
       </w:r>
@@ -2895,14 +2964,16 @@
           <w:bCs/>
           <w:sz w:val="28"/>
           <w:szCs w:val="28"/>
-        </w:rPr>
-      </w:pPr>
-      <w:r>
-        <w:rPr>
-          <w:rFonts w:ascii="Times New Roman" w:hAnsi="Times New Roman" w:cs="Times New Roman"/>
-          <w:bCs/>
-          <w:sz w:val="28"/>
-          <w:szCs w:val="28"/>
+          <w:lang w:val="vi-VN"/>
+        </w:rPr>
+      </w:pPr>
+      <w:r>
+        <w:rPr>
+          <w:rFonts w:ascii="Times New Roman" w:hAnsi="Times New Roman" w:cs="Times New Roman"/>
+          <w:bCs/>
+          <w:sz w:val="28"/>
+          <w:szCs w:val="28"/>
+          <w:lang w:val="vi-VN"/>
         </w:rPr>
         <w:tab/>
         <w:t xml:space="preserve">- Trung cấp chính quy tuyển mới: Tuyển sinh toàn quốc tại Trường Cao đẳng ANND I (T08) và khu vực phía Nam tại trường Cao đẳng CSND II (T10) </w:t>
@@ -2917,14 +2988,16 @@
           <w:b/>
           <w:sz w:val="28"/>
           <w:szCs w:val="28"/>
-        </w:rPr>
-      </w:pPr>
-      <w:r>
-        <w:rPr>
-          <w:rFonts w:ascii="Times New Roman" w:hAnsi="Times New Roman" w:cs="Times New Roman"/>
-          <w:b/>
-          <w:sz w:val="28"/>
-          <w:szCs w:val="28"/>
+          <w:lang w:val="vi-VN"/>
+        </w:rPr>
+      </w:pPr>
+      <w:r>
+        <w:rPr>
+          <w:rFonts w:ascii="Times New Roman" w:hAnsi="Times New Roman" w:cs="Times New Roman"/>
+          <w:b/>
+          <w:sz w:val="28"/>
+          <w:szCs w:val="28"/>
+          <w:lang w:val="vi-VN"/>
         </w:rPr>
         <w:tab/>
         <w:t>3. Tiêu chuẩn</w:t>
@@ -2938,14 +3011,16 @@
           <w:rFonts w:ascii="Times New Roman" w:hAnsi="Times New Roman" w:cs="Times New Roman"/>
           <w:sz w:val="28"/>
           <w:szCs w:val="28"/>
-        </w:rPr>
-      </w:pPr>
-      <w:r>
-        <w:rPr>
-          <w:rFonts w:ascii="Times New Roman" w:hAnsi="Times New Roman" w:cs="Times New Roman"/>
-          <w:b/>
-          <w:sz w:val="28"/>
-          <w:szCs w:val="28"/>
+          <w:lang w:val="vi-VN"/>
+        </w:rPr>
+      </w:pPr>
+      <w:r>
+        <w:rPr>
+          <w:rFonts w:ascii="Times New Roman" w:hAnsi="Times New Roman" w:cs="Times New Roman"/>
+          <w:b/>
+          <w:sz w:val="28"/>
+          <w:szCs w:val="28"/>
+          <w:lang w:val="vi-VN"/>
         </w:rPr>
         <w:tab/>
         <w:t>- Học lực:</w:t>
@@ -2955,6 +3030,7 @@
           <w:rFonts w:ascii="Times New Roman" w:hAnsi="Times New Roman" w:cs="Times New Roman"/>
           <w:sz w:val="28"/>
           <w:szCs w:val="28"/>
+          <w:lang w:val="vi-VN"/>
         </w:rPr>
         <w:t xml:space="preserve"> Tốt nghiệp THPT hoặc tương đương. Trong các năm học THPT đạt học lực Khá trở lên (riêng chiến sỹ nghĩa vụ đạt từ Trung bình trở lên)</w:t>
       </w:r>
@@ -2967,13 +3043,15 @@
           <w:rFonts w:ascii="Times New Roman" w:hAnsi="Times New Roman" w:cs="Times New Roman"/>
           <w:sz w:val="28"/>
           <w:szCs w:val="28"/>
-        </w:rPr>
-      </w:pPr>
-      <w:r>
-        <w:rPr>
-          <w:rFonts w:ascii="Times New Roman" w:hAnsi="Times New Roman" w:cs="Times New Roman"/>
-          <w:sz w:val="28"/>
-          <w:szCs w:val="28"/>
+          <w:lang w:val="vi-VN"/>
+        </w:rPr>
+      </w:pPr>
+      <w:r>
+        <w:rPr>
+          <w:rFonts w:ascii="Times New Roman" w:hAnsi="Times New Roman" w:cs="Times New Roman"/>
+          <w:sz w:val="28"/>
+          <w:szCs w:val="28"/>
+          <w:lang w:val="vi-VN"/>
         </w:rPr>
         <w:tab/>
       </w:r>
@@ -2983,6 +3061,7 @@
           <w:b/>
           <w:sz w:val="28"/>
           <w:szCs w:val="28"/>
+          <w:lang w:val="vi-VN"/>
         </w:rPr>
         <w:t>- Điểm môn thi:</w:t>
       </w:r>
@@ -2991,6 +3070,7 @@
           <w:rFonts w:ascii="Times New Roman" w:hAnsi="Times New Roman" w:cs="Times New Roman"/>
           <w:sz w:val="28"/>
           <w:szCs w:val="28"/>
+          <w:lang w:val="vi-VN"/>
         </w:rPr>
         <w:t xml:space="preserve"> từng môn thuộc tổ hợp </w:t>
       </w:r>
@@ -3000,6 +3080,7 @@
           <w:b/>
           <w:sz w:val="28"/>
           <w:szCs w:val="28"/>
+          <w:lang w:val="vi-VN"/>
         </w:rPr>
         <w:t>đạt từ 7.0 điểm</w:t>
       </w:r>
@@ -3008,6 +3089,7 @@
           <w:rFonts w:ascii="Times New Roman" w:hAnsi="Times New Roman" w:cs="Times New Roman"/>
           <w:sz w:val="28"/>
           <w:szCs w:val="28"/>
+          <w:lang w:val="vi-VN"/>
         </w:rPr>
         <w:t xml:space="preserve"> trở lên, người dân tộc thiểu số </w:t>
       </w:r>
@@ -3017,6 +3099,7 @@
           <w:b/>
           <w:sz w:val="28"/>
           <w:szCs w:val="28"/>
+          <w:lang w:val="vi-VN"/>
         </w:rPr>
         <w:t>đạt từ 6.5 điểm</w:t>
       </w:r>
@@ -3025,6 +3108,7 @@
           <w:rFonts w:ascii="Times New Roman" w:hAnsi="Times New Roman" w:cs="Times New Roman"/>
           <w:sz w:val="28"/>
           <w:szCs w:val="28"/>
+          <w:lang w:val="vi-VN"/>
         </w:rPr>
         <w:t xml:space="preserve"> trở lên (Không áp dụng với chiến sỹ nghĩa vụ tại ngũ)</w:t>
       </w:r>
@@ -3038,14 +3122,16 @@
           <w:b/>
           <w:sz w:val="28"/>
           <w:szCs w:val="28"/>
-        </w:rPr>
-      </w:pPr>
-      <w:r>
-        <w:rPr>
-          <w:rFonts w:ascii="Times New Roman" w:hAnsi="Times New Roman" w:cs="Times New Roman"/>
-          <w:b/>
-          <w:sz w:val="28"/>
-          <w:szCs w:val="28"/>
+          <w:lang w:val="vi-VN"/>
+        </w:rPr>
+      </w:pPr>
+      <w:r>
+        <w:rPr>
+          <w:rFonts w:ascii="Times New Roman" w:hAnsi="Times New Roman" w:cs="Times New Roman"/>
+          <w:b/>
+          <w:sz w:val="28"/>
+          <w:szCs w:val="28"/>
+          <w:lang w:val="vi-VN"/>
         </w:rPr>
         <w:lastRenderedPageBreak/>
         <w:tab/>
@@ -3055,6 +3141,7 @@
           <w:rFonts w:ascii="Times New Roman" w:hAnsi="Times New Roman" w:cs="Times New Roman"/>
           <w:sz w:val="28"/>
           <w:szCs w:val="28"/>
+          <w:lang w:val="vi-VN"/>
         </w:rPr>
         <w:t xml:space="preserve">- </w:t>
       </w:r>
@@ -3064,6 +3151,7 @@
           <w:b/>
           <w:sz w:val="28"/>
           <w:szCs w:val="28"/>
+          <w:lang w:val="vi-VN"/>
         </w:rPr>
         <w:t>Tiêu chuẩn về sức khỏe:</w:t>
       </w:r>
@@ -3076,14 +3164,16 @@
           <w:rFonts w:ascii="Times New Roman" w:hAnsi="Times New Roman" w:cs="Times New Roman"/>
           <w:sz w:val="28"/>
           <w:szCs w:val="28"/>
-        </w:rPr>
-      </w:pPr>
-      <w:r>
-        <w:rPr>
-          <w:rFonts w:ascii="Times New Roman" w:hAnsi="Times New Roman" w:cs="Times New Roman"/>
-          <w:b/>
-          <w:sz w:val="28"/>
-          <w:szCs w:val="28"/>
+          <w:lang w:val="vi-VN"/>
+        </w:rPr>
+      </w:pPr>
+      <w:r>
+        <w:rPr>
+          <w:rFonts w:ascii="Times New Roman" w:hAnsi="Times New Roman" w:cs="Times New Roman"/>
+          <w:b/>
+          <w:sz w:val="28"/>
+          <w:szCs w:val="28"/>
+          <w:lang w:val="vi-VN"/>
         </w:rPr>
         <w:tab/>
       </w:r>
@@ -3092,6 +3182,7 @@
           <w:rFonts w:ascii="Times New Roman" w:hAnsi="Times New Roman" w:cs="Times New Roman"/>
           <w:sz w:val="28"/>
           <w:szCs w:val="28"/>
+          <w:lang w:val="vi-VN"/>
         </w:rPr>
         <w:t>+ Chiều cao: nam từ đủ 164 đến 195cm; nữ từ đủ 158 đến 180cm (Thí sinh dân tộc thiểu số và đối tượng ưu tiên có tiêu chuẩn thấp hơn tuỳ diện).</w:t>
       </w:r>
@@ -3104,13 +3195,15 @@
           <w:rFonts w:ascii="Times New Roman" w:hAnsi="Times New Roman" w:cs="Times New Roman"/>
           <w:sz w:val="28"/>
           <w:szCs w:val="28"/>
-        </w:rPr>
-      </w:pPr>
-      <w:r>
-        <w:rPr>
-          <w:rFonts w:ascii="Times New Roman" w:hAnsi="Times New Roman" w:cs="Times New Roman"/>
-          <w:sz w:val="28"/>
-          <w:szCs w:val="28"/>
+          <w:lang w:val="vi-VN"/>
+        </w:rPr>
+      </w:pPr>
+      <w:r>
+        <w:rPr>
+          <w:rFonts w:ascii="Times New Roman" w:hAnsi="Times New Roman" w:cs="Times New Roman"/>
+          <w:sz w:val="28"/>
+          <w:szCs w:val="28"/>
+          <w:lang w:val="vi-VN"/>
         </w:rPr>
         <w:tab/>
         <w:t>+ Thị lực: Cận/viễn không quá 3 đi-ốp; tổng thị lực 2 mắt đạt 19/10 trở lên.</w:t>
@@ -3124,13 +3217,15 @@
           <w:rFonts w:ascii="Times New Roman" w:hAnsi="Times New Roman" w:cs="Times New Roman"/>
           <w:sz w:val="28"/>
           <w:szCs w:val="28"/>
-        </w:rPr>
-      </w:pPr>
-      <w:r>
-        <w:rPr>
-          <w:rFonts w:ascii="Times New Roman" w:hAnsi="Times New Roman" w:cs="Times New Roman"/>
-          <w:sz w:val="28"/>
-          <w:szCs w:val="28"/>
+          <w:lang w:val="vi-VN"/>
+        </w:rPr>
+      </w:pPr>
+      <w:r>
+        <w:rPr>
+          <w:rFonts w:ascii="Times New Roman" w:hAnsi="Times New Roman" w:cs="Times New Roman"/>
+          <w:sz w:val="28"/>
+          <w:szCs w:val="28"/>
+          <w:lang w:val="vi-VN"/>
         </w:rPr>
         <w:tab/>
         <w:t xml:space="preserve">- </w:t>
@@ -3141,6 +3236,7 @@
           <w:b/>
           <w:sz w:val="28"/>
           <w:szCs w:val="28"/>
+          <w:lang w:val="vi-VN"/>
         </w:rPr>
         <w:t>Hạnh kiểm</w:t>
       </w:r>
@@ -3149,6 +3245,7 @@
           <w:rFonts w:ascii="Times New Roman" w:hAnsi="Times New Roman" w:cs="Times New Roman"/>
           <w:sz w:val="28"/>
           <w:szCs w:val="28"/>
+          <w:lang w:val="vi-VN"/>
         </w:rPr>
         <w:t>: đạt loại Khá trở lên</w:t>
       </w:r>
@@ -3162,13 +3259,15 @@
           <w:b/>
           <w:sz w:val="28"/>
           <w:szCs w:val="28"/>
-        </w:rPr>
-      </w:pPr>
-      <w:r>
-        <w:rPr>
-          <w:rFonts w:ascii="Times New Roman" w:hAnsi="Times New Roman" w:cs="Times New Roman"/>
-          <w:sz w:val="28"/>
-          <w:szCs w:val="28"/>
+          <w:lang w:val="vi-VN"/>
+        </w:rPr>
+      </w:pPr>
+      <w:r>
+        <w:rPr>
+          <w:rFonts w:ascii="Times New Roman" w:hAnsi="Times New Roman" w:cs="Times New Roman"/>
+          <w:sz w:val="28"/>
+          <w:szCs w:val="28"/>
+          <w:lang w:val="vi-VN"/>
         </w:rPr>
         <w:tab/>
       </w:r>
@@ -3178,6 +3277,7 @@
           <w:b/>
           <w:sz w:val="28"/>
           <w:szCs w:val="28"/>
+          <w:lang w:val="vi-VN"/>
         </w:rPr>
         <w:t xml:space="preserve">4. Hồ sơ khi đăng ký </w:t>
       </w:r>
@@ -3190,13 +3290,15 @@
           <w:rFonts w:ascii="Times New Roman" w:hAnsi="Times New Roman" w:cs="Times New Roman"/>
           <w:sz w:val="28"/>
           <w:szCs w:val="28"/>
-        </w:rPr>
-      </w:pPr>
-      <w:r>
-        <w:rPr>
-          <w:rFonts w:ascii="Times New Roman" w:hAnsi="Times New Roman" w:cs="Times New Roman"/>
-          <w:sz w:val="28"/>
-          <w:szCs w:val="28"/>
+          <w:lang w:val="vi-VN"/>
+        </w:rPr>
+      </w:pPr>
+      <w:r>
+        <w:rPr>
+          <w:rFonts w:ascii="Times New Roman" w:hAnsi="Times New Roman" w:cs="Times New Roman"/>
+          <w:sz w:val="28"/>
+          <w:szCs w:val="28"/>
+          <w:lang w:val="vi-VN"/>
         </w:rPr>
         <w:tab/>
         <w:t>- Đối với tuyển sinh trình độ đại học, trung cấp chính quy tuyển mới công dân tốt nghiệp trung học phổ thông: khi đến Công an xã đăng ký dự tuyển mang theo: Căn cước công dân (hoặc Căn cước); Giấy khai sinh; Học bạ (có điểm tổng kết THPT năm 10, 11 và học kỳ I lớp 12), chứng chỉ,….CSNV xuất ngũ ngoài các giấy tờ nêu trên khi đi mang theo Quyết định xuất ngũ</w:t>
@@ -3210,13 +3312,15 @@
           <w:rFonts w:ascii="Times New Roman" w:hAnsi="Times New Roman" w:cs="Times New Roman"/>
           <w:sz w:val="28"/>
           <w:szCs w:val="28"/>
-        </w:rPr>
-      </w:pPr>
-      <w:r>
-        <w:rPr>
-          <w:rFonts w:ascii="Times New Roman" w:hAnsi="Times New Roman" w:cs="Times New Roman"/>
-          <w:sz w:val="28"/>
-          <w:szCs w:val="28"/>
+          <w:lang w:val="vi-VN"/>
+        </w:rPr>
+      </w:pPr>
+      <w:r>
+        <w:rPr>
+          <w:rFonts w:ascii="Times New Roman" w:hAnsi="Times New Roman" w:cs="Times New Roman"/>
+          <w:sz w:val="28"/>
+          <w:szCs w:val="28"/>
+          <w:lang w:val="vi-VN"/>
         </w:rPr>
         <w:tab/>
         <w:t>- Đối với Văn bằng 2 tuyển mới: Thi sinh mang theo Căn cước công dân (hoặc Căn cước); Giấy khai sinh; Bằng tốt nghiệp Đại học, Bảng điểm Đại học, Bằng tốt nghiệp THPT, chứng chỉ,…</w:t>
@@ -3240,6 +3344,7 @@
           <w:b/>
           <w:sz w:val="28"/>
           <w:szCs w:val="28"/>
+          <w:lang w:val="vi-VN"/>
         </w:rPr>
         <w:t>5. Thời hạn, địa điểm đăng ký</w:t>
       </w:r>
@@ -3252,6 +3357,7 @@
           <w:rFonts w:ascii="Times New Roman" w:hAnsi="Times New Roman" w:cs="Times New Roman"/>
           <w:sz w:val="28"/>
           <w:szCs w:val="28"/>
+          <w:lang w:val="vi-VN"/>
         </w:rPr>
       </w:pPr>
       <w:r>
@@ -3261,6 +3367,7 @@
           <w:i/>
           <w:sz w:val="28"/>
           <w:szCs w:val="28"/>
+          <w:lang w:val="vi-VN"/>
         </w:rPr>
         <w:tab/>
         <w:t>-</w:t>
@@ -3270,6 +3377,7 @@
           <w:rFonts w:ascii="Times New Roman" w:hAnsi="Times New Roman" w:cs="Times New Roman"/>
           <w:sz w:val="28"/>
           <w:szCs w:val="28"/>
+          <w:lang w:val="vi-VN"/>
         </w:rPr>
         <w:t xml:space="preserve"> </w:t>
       </w:r>
@@ -3279,6 +3387,7 @@
           <w:b/>
           <w:sz w:val="28"/>
           <w:szCs w:val="28"/>
+          <w:lang w:val="vi-VN"/>
         </w:rPr>
         <w:t xml:space="preserve">Địa điểm đăng ký: </w:t>
       </w:r>
@@ -3287,6 +3396,7 @@
           <w:rFonts w:ascii="Times New Roman" w:hAnsi="Times New Roman" w:cs="Times New Roman"/>
           <w:sz w:val="28"/>
           <w:szCs w:val="28"/>
+          <w:lang w:val="vi-VN"/>
         </w:rPr>
         <w:t>Công an xã An Viễn, thành</w:t>
       </w:r>
@@ -3304,6 +3414,7 @@
           <w:rFonts w:ascii="Times New Roman" w:hAnsi="Times New Roman" w:cs="Times New Roman"/>
           <w:sz w:val="28"/>
           <w:szCs w:val="28"/>
+          <w:lang w:val="vi-VN"/>
         </w:rPr>
         <w:t xml:space="preserve"> Đồng Nai (địa chỉ: ấp Phát</w:t>
       </w:r>
@@ -3321,6 +3432,7 @@
           <w:rFonts w:ascii="Times New Roman" w:hAnsi="Times New Roman" w:cs="Times New Roman"/>
           <w:sz w:val="28"/>
           <w:szCs w:val="28"/>
+          <w:lang w:val="vi-VN"/>
         </w:rPr>
         <w:t>, xã An Viễn, thành</w:t>
       </w:r>
@@ -3338,6 +3450,7 @@
           <w:rFonts w:ascii="Times New Roman" w:hAnsi="Times New Roman" w:cs="Times New Roman"/>
           <w:sz w:val="28"/>
           <w:szCs w:val="28"/>
+          <w:lang w:val="vi-VN"/>
         </w:rPr>
         <w:t xml:space="preserve"> Đồng Nai)</w:t>
       </w:r>
@@ -3350,13 +3463,15 @@
           <w:rFonts w:ascii="Times New Roman" w:hAnsi="Times New Roman" w:cs="Times New Roman"/>
           <w:sz w:val="28"/>
           <w:szCs w:val="28"/>
-        </w:rPr>
-      </w:pPr>
-      <w:r>
-        <w:rPr>
-          <w:rFonts w:ascii="Times New Roman" w:hAnsi="Times New Roman" w:cs="Times New Roman"/>
-          <w:sz w:val="28"/>
-          <w:szCs w:val="28"/>
+          <w:lang w:val="vi-VN"/>
+        </w:rPr>
+      </w:pPr>
+      <w:r>
+        <w:rPr>
+          <w:rFonts w:ascii="Times New Roman" w:hAnsi="Times New Roman" w:cs="Times New Roman"/>
+          <w:sz w:val="28"/>
+          <w:szCs w:val="28"/>
+          <w:lang w:val="vi-VN"/>
         </w:rPr>
         <w:tab/>
       </w:r>
@@ -3366,6 +3481,7 @@
           <w:b/>
           <w:sz w:val="28"/>
           <w:szCs w:val="28"/>
+          <w:lang w:val="vi-VN"/>
         </w:rPr>
         <w:t>- Số điện thoại liên hệ:</w:t>
       </w:r>
@@ -3374,6 +3490,7 @@
           <w:rFonts w:ascii="Times New Roman" w:hAnsi="Times New Roman" w:cs="Times New Roman"/>
           <w:sz w:val="28"/>
           <w:szCs w:val="28"/>
+          <w:lang w:val="vi-VN"/>
         </w:rPr>
         <w:t xml:space="preserve"> 02513.538.187 hoặc 0989</w:t>
       </w:r>
@@ -3391,6 +3508,7 @@
           <w:rFonts w:ascii="Times New Roman" w:hAnsi="Times New Roman" w:cs="Times New Roman"/>
           <w:sz w:val="28"/>
           <w:szCs w:val="28"/>
+          <w:lang w:val="vi-VN"/>
         </w:rPr>
         <w:t>(gặp đồng chí Thượng úy Phạm Xuân Sang – Cán bộ Công an xã).</w:t>
       </w:r>
@@ -3405,6 +3523,7 @@
           <w:bCs/>
           <w:sz w:val="28"/>
           <w:szCs w:val="28"/>
+          <w:lang w:val="vi-VN"/>
         </w:rPr>
       </w:pPr>
       <w:r>
@@ -3423,6 +3542,7 @@
           <w:bCs/>
           <w:sz w:val="28"/>
           <w:szCs w:val="28"/>
+          <w:lang w:val="vi-VN"/>
         </w:rPr>
         <w:t>Đổi mới hình thức thi đánh giá năng lực</w:t>
       </w:r>
@@ -3444,6 +3564,7 @@
           <w:bCs/>
           <w:sz w:val="28"/>
           <w:szCs w:val="28"/>
+          <w:lang w:val="vi-VN"/>
         </w:rPr>
         <w:t>trong tuyển sinh tuyển mới các Học viên, Trường CAND</w:t>
       </w:r>
@@ -3458,15 +3579,17 @@
           <w:bCs/>
           <w:sz w:val="28"/>
           <w:szCs w:val="28"/>
-        </w:rPr>
-      </w:pPr>
-      <w:r>
-        <w:rPr>
-          <w:rFonts w:ascii="Times New Roman" w:hAnsi="Times New Roman" w:cs="Times New Roman"/>
-          <w:b/>
-          <w:bCs/>
-          <w:sz w:val="28"/>
-          <w:szCs w:val="28"/>
+          <w:lang w:val="vi-VN"/>
+        </w:rPr>
+      </w:pPr>
+      <w:r>
+        <w:rPr>
+          <w:rFonts w:ascii="Times New Roman" w:hAnsi="Times New Roman" w:cs="Times New Roman"/>
+          <w:b/>
+          <w:bCs/>
+          <w:sz w:val="28"/>
+          <w:szCs w:val="28"/>
+          <w:lang w:val="vi-VN"/>
         </w:rPr>
         <w:t xml:space="preserve">* </w:t>
       </w:r>
@@ -3478,6 +3601,7 @@
           <w:i/>
           <w:sz w:val="28"/>
           <w:szCs w:val="28"/>
+          <w:lang w:val="vi-VN"/>
         </w:rPr>
         <w:t>Đối với Kỳ thi tuyển sinh đại học chính quy tuyển mới đối với công dân có bằng tốt nghiệp đại học trở lên (Văn bằng 2 tuyển mới):</w:t>
       </w:r>
@@ -3488,6 +3612,7 @@
           <w:bCs/>
           <w:sz w:val="28"/>
           <w:szCs w:val="28"/>
+          <w:lang w:val="vi-VN"/>
         </w:rPr>
         <w:t xml:space="preserve"> </w:t>
       </w:r>
@@ -3497,6 +3622,7 @@
           <w:bCs/>
           <w:sz w:val="28"/>
           <w:szCs w:val="28"/>
+          <w:lang w:val="vi-VN"/>
         </w:rPr>
         <w:t>Triển khai tổ chức thi trên máy tính từ năm 2026.</w:t>
       </w:r>
@@ -3510,14 +3636,16 @@
           <w:bCs/>
           <w:sz w:val="28"/>
           <w:szCs w:val="28"/>
-        </w:rPr>
-      </w:pPr>
-      <w:r>
-        <w:rPr>
-          <w:rFonts w:ascii="Times New Roman" w:hAnsi="Times New Roman" w:cs="Times New Roman"/>
-          <w:bCs/>
-          <w:sz w:val="28"/>
-          <w:szCs w:val="28"/>
+          <w:lang w:val="vi-VN"/>
+        </w:rPr>
+      </w:pPr>
+      <w:r>
+        <w:rPr>
+          <w:rFonts w:ascii="Times New Roman" w:hAnsi="Times New Roman" w:cs="Times New Roman"/>
+          <w:bCs/>
+          <w:sz w:val="28"/>
+          <w:szCs w:val="28"/>
+          <w:lang w:val="vi-VN"/>
         </w:rPr>
         <w:tab/>
       </w:r>
@@ -3528,6 +3656,7 @@
           <w:bCs/>
           <w:sz w:val="28"/>
           <w:szCs w:val="28"/>
+          <w:lang w:val="vi-VN"/>
         </w:rPr>
         <w:t xml:space="preserve">* </w:t>
       </w:r>
@@ -3539,6 +3668,7 @@
           <w:i/>
           <w:sz w:val="28"/>
           <w:szCs w:val="28"/>
+          <w:lang w:val="vi-VN"/>
         </w:rPr>
         <w:t xml:space="preserve">Đối với Kỳ thi tuyển sinh đại học chính quy tuyển mới đối với công dân tốt nghiệp trung học phổ thông (Đại học chính quy tuyển mới): </w:t>
       </w:r>
@@ -3548,6 +3678,7 @@
           <w:bCs/>
           <w:sz w:val="28"/>
           <w:szCs w:val="28"/>
+          <w:lang w:val="vi-VN"/>
         </w:rPr>
         <w:t>Công dân</w:t>
       </w:r>
@@ -3559,6 +3690,7 @@
           <w:i/>
           <w:sz w:val="28"/>
           <w:szCs w:val="28"/>
+          <w:lang w:val="vi-VN"/>
         </w:rPr>
         <w:t xml:space="preserve"> </w:t>
       </w:r>
@@ -3568,6 +3700,7 @@
           <w:bCs/>
           <w:sz w:val="28"/>
           <w:szCs w:val="28"/>
+          <w:lang w:val="vi-VN"/>
         </w:rPr>
         <w:t xml:space="preserve">chủ động tìm hiểu có định hướng ôn thi và làm quen về chủ trương thi trên máy tính của Bộ Công an trong các năm tiếp theo. Năm 2027 </w:t>
       </w:r>
@@ -3579,6 +3712,7 @@
           <w:i/>
           <w:sz w:val="28"/>
           <w:szCs w:val="28"/>
+          <w:lang w:val="vi-VN"/>
         </w:rPr>
         <w:t>thí điểm tổ chức thi trên máy tính tại một số trường như B06, T06, T07</w:t>
       </w:r>
@@ -3588,6 +3722,7 @@
           <w:bCs/>
           <w:sz w:val="28"/>
           <w:szCs w:val="28"/>
+          <w:lang w:val="vi-VN"/>
         </w:rPr>
         <w:t xml:space="preserve"> song song tổ chức </w:t>
       </w:r>
@@ -3599,6 +3734,7 @@
           <w:i/>
           <w:sz w:val="28"/>
           <w:szCs w:val="28"/>
+          <w:lang w:val="vi-VN"/>
         </w:rPr>
         <w:t xml:space="preserve">thi trên giấy đối với các trường còn lại. </w:t>
       </w:r>
@@ -3608,6 +3744,7 @@
           <w:bCs/>
           <w:sz w:val="28"/>
           <w:szCs w:val="28"/>
+          <w:lang w:val="vi-VN"/>
         </w:rPr>
         <w:t xml:space="preserve">Năm 2028 tổ chức thi trên máy tính áp dụng cho tất cả các trường trong CAND. </w:t>
       </w:r>
@@ -4643,15 +4780,15 @@
     <w:lsdException w:name="Unresolved Mention" w:semiHidden="1" w:unhideWhenUsed="1"/>
     <w:lsdException w:name="Smart Link" w:semiHidden="1" w:unhideWhenUsed="1"/>
   </w:latentStyles>
-  <w:style w:type="paragraph" w:default="1" w:styleId="Normal">
+  <w:style w:type="paragraph" w:default="1" w:styleId="Binhthng">
     <w:name w:val="Normal"/>
     <w:qFormat/>
   </w:style>
-  <w:style w:type="paragraph" w:styleId="Heading1">
+  <w:style w:type="paragraph" w:styleId="u1">
     <w:name w:val="heading 1"/>
-    <w:basedOn w:val="Normal"/>
-    <w:next w:val="Normal"/>
-    <w:link w:val="Heading1Char"/>
+    <w:basedOn w:val="Binhthng"/>
+    <w:next w:val="Binhthng"/>
+    <w:link w:val="u1Char"/>
     <w:uiPriority w:val="9"/>
     <w:qFormat/>
     <w:rsid w:val="002319D7"/>
@@ -4668,11 +4805,11 @@
       <w:szCs w:val="40"/>
     </w:rPr>
   </w:style>
-  <w:style w:type="paragraph" w:styleId="Heading2">
+  <w:style w:type="paragraph" w:styleId="u2">
     <w:name w:val="heading 2"/>
-    <w:basedOn w:val="Normal"/>
-    <w:next w:val="Normal"/>
-    <w:link w:val="Heading2Char"/>
+    <w:basedOn w:val="Binhthng"/>
+    <w:next w:val="Binhthng"/>
+    <w:link w:val="u2Char"/>
     <w:uiPriority w:val="9"/>
     <w:semiHidden/>
     <w:unhideWhenUsed/>
@@ -4691,11 +4828,11 @@
       <w:szCs w:val="32"/>
     </w:rPr>
   </w:style>
-  <w:style w:type="paragraph" w:styleId="Heading3">
+  <w:style w:type="paragraph" w:styleId="u3">
     <w:name w:val="heading 3"/>
-    <w:basedOn w:val="Normal"/>
-    <w:next w:val="Normal"/>
-    <w:link w:val="Heading3Char"/>
+    <w:basedOn w:val="Binhthng"/>
+    <w:next w:val="Binhthng"/>
+    <w:link w:val="u3Char"/>
     <w:uiPriority w:val="9"/>
     <w:semiHidden/>
     <w:unhideWhenUsed/>
@@ -4714,11 +4851,11 @@
       <w:szCs w:val="28"/>
     </w:rPr>
   </w:style>
-  <w:style w:type="paragraph" w:styleId="Heading4">
+  <w:style w:type="paragraph" w:styleId="u4">
     <w:name w:val="heading 4"/>
-    <w:basedOn w:val="Normal"/>
-    <w:next w:val="Normal"/>
-    <w:link w:val="Heading4Char"/>
+    <w:basedOn w:val="Binhthng"/>
+    <w:next w:val="Binhthng"/>
+    <w:link w:val="u4Char"/>
     <w:uiPriority w:val="9"/>
     <w:semiHidden/>
     <w:unhideWhenUsed/>
@@ -4737,11 +4874,11 @@
       <w:color w:val="0F4761" w:themeColor="accent1" w:themeShade="BF"/>
     </w:rPr>
   </w:style>
-  <w:style w:type="paragraph" w:styleId="Heading5">
+  <w:style w:type="paragraph" w:styleId="u5">
     <w:name w:val="heading 5"/>
-    <w:basedOn w:val="Normal"/>
-    <w:next w:val="Normal"/>
-    <w:link w:val="Heading5Char"/>
+    <w:basedOn w:val="Binhthng"/>
+    <w:next w:val="Binhthng"/>
+    <w:link w:val="u5Char"/>
     <w:uiPriority w:val="9"/>
     <w:semiHidden/>
     <w:unhideWhenUsed/>
@@ -4758,11 +4895,11 @@
       <w:color w:val="0F4761" w:themeColor="accent1" w:themeShade="BF"/>
     </w:rPr>
   </w:style>
-  <w:style w:type="paragraph" w:styleId="Heading6">
+  <w:style w:type="paragraph" w:styleId="u6">
     <w:name w:val="heading 6"/>
-    <w:basedOn w:val="Normal"/>
-    <w:next w:val="Normal"/>
-    <w:link w:val="Heading6Char"/>
+    <w:basedOn w:val="Binhthng"/>
+    <w:next w:val="Binhthng"/>
+    <w:link w:val="u6Char"/>
     <w:uiPriority w:val="9"/>
     <w:semiHidden/>
     <w:unhideWhenUsed/>
@@ -4781,11 +4918,11 @@
       <w:color w:val="595959" w:themeColor="text1" w:themeTint="A6"/>
     </w:rPr>
   </w:style>
-  <w:style w:type="paragraph" w:styleId="Heading7">
+  <w:style w:type="paragraph" w:styleId="u7">
     <w:name w:val="heading 7"/>
-    <w:basedOn w:val="Normal"/>
-    <w:next w:val="Normal"/>
-    <w:link w:val="Heading7Char"/>
+    <w:basedOn w:val="Binhthng"/>
+    <w:next w:val="Binhthng"/>
+    <w:link w:val="u7Char"/>
     <w:uiPriority w:val="9"/>
     <w:semiHidden/>
     <w:unhideWhenUsed/>
@@ -4802,11 +4939,11 @@
       <w:color w:val="595959" w:themeColor="text1" w:themeTint="A6"/>
     </w:rPr>
   </w:style>
-  <w:style w:type="paragraph" w:styleId="Heading8">
+  <w:style w:type="paragraph" w:styleId="u8">
     <w:name w:val="heading 8"/>
-    <w:basedOn w:val="Normal"/>
-    <w:next w:val="Normal"/>
-    <w:link w:val="Heading8Char"/>
+    <w:basedOn w:val="Binhthng"/>
+    <w:next w:val="Binhthng"/>
+    <w:link w:val="u8Char"/>
     <w:uiPriority w:val="9"/>
     <w:semiHidden/>
     <w:unhideWhenUsed/>
@@ -4825,11 +4962,11 @@
       <w:color w:val="272727" w:themeColor="text1" w:themeTint="D8"/>
     </w:rPr>
   </w:style>
-  <w:style w:type="paragraph" w:styleId="Heading9">
+  <w:style w:type="paragraph" w:styleId="u9">
     <w:name w:val="heading 9"/>
-    <w:basedOn w:val="Normal"/>
-    <w:next w:val="Normal"/>
-    <w:link w:val="Heading9Char"/>
+    <w:basedOn w:val="Binhthng"/>
+    <w:next w:val="Binhthng"/>
+    <w:link w:val="u9Char"/>
     <w:uiPriority w:val="9"/>
     <w:semiHidden/>
     <w:unhideWhenUsed/>
@@ -4846,12 +4983,13 @@
       <w:color w:val="272727" w:themeColor="text1" w:themeTint="D8"/>
     </w:rPr>
   </w:style>
-  <w:style w:type="character" w:default="1" w:styleId="DefaultParagraphFont">
+  <w:style w:type="character" w:default="1" w:styleId="Phngmcinhcuaoanvn">
     <w:name w:val="Default Paragraph Font"/>
     <w:uiPriority w:val="1"/>
+    <w:semiHidden/>
     <w:unhideWhenUsed/>
   </w:style>
-  <w:style w:type="table" w:default="1" w:styleId="TableNormal">
+  <w:style w:type="table" w:default="1" w:styleId="BangThngthng">
     <w:name w:val="Normal Table"/>
     <w:uiPriority w:val="99"/>
     <w:semiHidden/>
@@ -4866,16 +5004,16 @@
       </w:tblCellMar>
     </w:tblPr>
   </w:style>
-  <w:style w:type="numbering" w:default="1" w:styleId="NoList">
+  <w:style w:type="numbering" w:default="1" w:styleId="Khngco">
     <w:name w:val="No List"/>
     <w:uiPriority w:val="99"/>
     <w:semiHidden/>
     <w:unhideWhenUsed/>
   </w:style>
-  <w:style w:type="character" w:customStyle="1" w:styleId="Heading1Char">
-    <w:name w:val="Heading 1 Char"/>
-    <w:basedOn w:val="DefaultParagraphFont"/>
-    <w:link w:val="Heading1"/>
+  <w:style w:type="character" w:customStyle="1" w:styleId="u1Char">
+    <w:name w:val="Đầu đề 1 Char"/>
+    <w:basedOn w:val="Phngmcinhcuaoanvn"/>
+    <w:link w:val="u1"/>
     <w:uiPriority w:val="9"/>
     <w:rsid w:val="002319D7"/>
     <w:rPr>
@@ -4885,10 +5023,10 @@
       <w:szCs w:val="40"/>
     </w:rPr>
   </w:style>
-  <w:style w:type="character" w:customStyle="1" w:styleId="Heading2Char">
-    <w:name w:val="Heading 2 Char"/>
-    <w:basedOn w:val="DefaultParagraphFont"/>
-    <w:link w:val="Heading2"/>
+  <w:style w:type="character" w:customStyle="1" w:styleId="u2Char">
+    <w:name w:val="Đầu đề 2 Char"/>
+    <w:basedOn w:val="Phngmcinhcuaoanvn"/>
+    <w:link w:val="u2"/>
     <w:uiPriority w:val="9"/>
     <w:semiHidden/>
     <w:rsid w:val="002319D7"/>
@@ -4899,10 +5037,10 @@
       <w:szCs w:val="32"/>
     </w:rPr>
   </w:style>
-  <w:style w:type="character" w:customStyle="1" w:styleId="Heading3Char">
-    <w:name w:val="Heading 3 Char"/>
-    <w:basedOn w:val="DefaultParagraphFont"/>
-    <w:link w:val="Heading3"/>
+  <w:style w:type="character" w:customStyle="1" w:styleId="u3Char">
+    <w:name w:val="Đầu đề 3 Char"/>
+    <w:basedOn w:val="Phngmcinhcuaoanvn"/>
+    <w:link w:val="u3"/>
     <w:uiPriority w:val="9"/>
     <w:semiHidden/>
     <w:rsid w:val="002319D7"/>
@@ -4913,10 +5051,10 @@
       <w:szCs w:val="28"/>
     </w:rPr>
   </w:style>
-  <w:style w:type="character" w:customStyle="1" w:styleId="Heading4Char">
-    <w:name w:val="Heading 4 Char"/>
-    <w:basedOn w:val="DefaultParagraphFont"/>
-    <w:link w:val="Heading4"/>
+  <w:style w:type="character" w:customStyle="1" w:styleId="u4Char">
+    <w:name w:val="Đầu đề 4 Char"/>
+    <w:basedOn w:val="Phngmcinhcuaoanvn"/>
+    <w:link w:val="u4"/>
     <w:uiPriority w:val="9"/>
     <w:semiHidden/>
     <w:rsid w:val="002319D7"/>
@@ -4927,10 +5065,10 @@
       <w:color w:val="0F4761" w:themeColor="accent1" w:themeShade="BF"/>
     </w:rPr>
   </w:style>
-  <w:style w:type="character" w:customStyle="1" w:styleId="Heading5Char">
-    <w:name w:val="Heading 5 Char"/>
-    <w:basedOn w:val="DefaultParagraphFont"/>
-    <w:link w:val="Heading5"/>
+  <w:style w:type="character" w:customStyle="1" w:styleId="u5Char">
+    <w:name w:val="Đầu đề 5 Char"/>
+    <w:basedOn w:val="Phngmcinhcuaoanvn"/>
+    <w:link w:val="u5"/>
     <w:uiPriority w:val="9"/>
     <w:semiHidden/>
     <w:rsid w:val="002319D7"/>
@@ -4939,10 +5077,10 @@
       <w:color w:val="0F4761" w:themeColor="accent1" w:themeShade="BF"/>
     </w:rPr>
   </w:style>
-  <w:style w:type="character" w:customStyle="1" w:styleId="Heading6Char">
-    <w:name w:val="Heading 6 Char"/>
-    <w:basedOn w:val="DefaultParagraphFont"/>
-    <w:link w:val="Heading6"/>
+  <w:style w:type="character" w:customStyle="1" w:styleId="u6Char">
+    <w:name w:val="Đầu đề 6 Char"/>
+    <w:basedOn w:val="Phngmcinhcuaoanvn"/>
+    <w:link w:val="u6"/>
     <w:uiPriority w:val="9"/>
     <w:semiHidden/>
     <w:rsid w:val="002319D7"/>
@@ -4953,10 +5091,10 @@
       <w:color w:val="595959" w:themeColor="text1" w:themeTint="A6"/>
     </w:rPr>
   </w:style>
-  <w:style w:type="character" w:customStyle="1" w:styleId="Heading7Char">
-    <w:name w:val="Heading 7 Char"/>
-    <w:basedOn w:val="DefaultParagraphFont"/>
-    <w:link w:val="Heading7"/>
+  <w:style w:type="character" w:customStyle="1" w:styleId="u7Char">
+    <w:name w:val="Đầu đề 7 Char"/>
+    <w:basedOn w:val="Phngmcinhcuaoanvn"/>
+    <w:link w:val="u7"/>
     <w:uiPriority w:val="9"/>
     <w:semiHidden/>
     <w:rsid w:val="002319D7"/>
@@ -4965,10 +5103,10 @@
       <w:color w:val="595959" w:themeColor="text1" w:themeTint="A6"/>
     </w:rPr>
   </w:style>
-  <w:style w:type="character" w:customStyle="1" w:styleId="Heading8Char">
-    <w:name w:val="Heading 8 Char"/>
-    <w:basedOn w:val="DefaultParagraphFont"/>
-    <w:link w:val="Heading8"/>
+  <w:style w:type="character" w:customStyle="1" w:styleId="u8Char">
+    <w:name w:val="Đầu đề 8 Char"/>
+    <w:basedOn w:val="Phngmcinhcuaoanvn"/>
+    <w:link w:val="u8"/>
     <w:uiPriority w:val="9"/>
     <w:semiHidden/>
     <w:rsid w:val="002319D7"/>
@@ -4979,10 +5117,10 @@
       <w:color w:val="272727" w:themeColor="text1" w:themeTint="D8"/>
     </w:rPr>
   </w:style>
-  <w:style w:type="character" w:customStyle="1" w:styleId="Heading9Char">
-    <w:name w:val="Heading 9 Char"/>
-    <w:basedOn w:val="DefaultParagraphFont"/>
-    <w:link w:val="Heading9"/>
+  <w:style w:type="character" w:customStyle="1" w:styleId="u9Char">
+    <w:name w:val="Đầu đề 9 Char"/>
+    <w:basedOn w:val="Phngmcinhcuaoanvn"/>
+    <w:link w:val="u9"/>
     <w:uiPriority w:val="9"/>
     <w:semiHidden/>
     <w:rsid w:val="002319D7"/>
@@ -4991,11 +5129,11 @@
       <w:color w:val="272727" w:themeColor="text1" w:themeTint="D8"/>
     </w:rPr>
   </w:style>
-  <w:style w:type="paragraph" w:styleId="Title">
+  <w:style w:type="paragraph" w:styleId="Tiu">
     <w:name w:val="Title"/>
-    <w:basedOn w:val="Normal"/>
-    <w:next w:val="Normal"/>
-    <w:link w:val="TitleChar"/>
+    <w:basedOn w:val="Binhthng"/>
+    <w:next w:val="Binhthng"/>
+    <w:link w:val="TiuChar"/>
     <w:uiPriority w:val="10"/>
     <w:qFormat/>
     <w:rsid w:val="002319D7"/>
@@ -5011,10 +5149,10 @@
       <w:szCs w:val="56"/>
     </w:rPr>
   </w:style>
-  <w:style w:type="character" w:customStyle="1" w:styleId="TitleChar">
-    <w:name w:val="Title Char"/>
-    <w:basedOn w:val="DefaultParagraphFont"/>
-    <w:link w:val="Title"/>
+  <w:style w:type="character" w:customStyle="1" w:styleId="TiuChar">
+    <w:name w:val="Tiêu đề Char"/>
+    <w:basedOn w:val="Phngmcinhcuaoanvn"/>
+    <w:link w:val="Tiu"/>
     <w:uiPriority w:val="10"/>
     <w:rsid w:val="002319D7"/>
     <w:rPr>
@@ -5025,11 +5163,11 @@
       <w:szCs w:val="56"/>
     </w:rPr>
   </w:style>
-  <w:style w:type="paragraph" w:styleId="Subtitle">
+  <w:style w:type="paragraph" w:styleId="Tiuphu">
     <w:name w:val="Subtitle"/>
-    <w:basedOn w:val="Normal"/>
-    <w:next w:val="Normal"/>
-    <w:link w:val="SubtitleChar"/>
+    <w:basedOn w:val="Binhthng"/>
+    <w:next w:val="Binhthng"/>
+    <w:link w:val="TiuphuChar"/>
     <w:uiPriority w:val="11"/>
     <w:qFormat/>
     <w:rsid w:val="002319D7"/>
@@ -5046,10 +5184,10 @@
       <w:szCs w:val="28"/>
     </w:rPr>
   </w:style>
-  <w:style w:type="character" w:customStyle="1" w:styleId="SubtitleChar">
-    <w:name w:val="Subtitle Char"/>
-    <w:basedOn w:val="DefaultParagraphFont"/>
-    <w:link w:val="Subtitle"/>
+  <w:style w:type="character" w:customStyle="1" w:styleId="TiuphuChar">
+    <w:name w:val="Tiêu đề phụ Char"/>
+    <w:basedOn w:val="Phngmcinhcuaoanvn"/>
+    <w:link w:val="Tiuphu"/>
     <w:uiPriority w:val="11"/>
     <w:rsid w:val="002319D7"/>
     <w:rPr>
@@ -5060,11 +5198,11 @@
       <w:szCs w:val="28"/>
     </w:rPr>
   </w:style>
-  <w:style w:type="paragraph" w:styleId="Quote">
+  <w:style w:type="paragraph" w:styleId="Litrichdn">
     <w:name w:val="Quote"/>
-    <w:basedOn w:val="Normal"/>
-    <w:next w:val="Normal"/>
-    <w:link w:val="QuoteChar"/>
+    <w:basedOn w:val="Binhthng"/>
+    <w:next w:val="Binhthng"/>
+    <w:link w:val="LitrichdnChar"/>
     <w:uiPriority w:val="29"/>
     <w:qFormat/>
     <w:rsid w:val="002319D7"/>
@@ -5078,10 +5216,10 @@
       <w:color w:val="404040" w:themeColor="text1" w:themeTint="BF"/>
     </w:rPr>
   </w:style>
-  <w:style w:type="character" w:customStyle="1" w:styleId="QuoteChar">
-    <w:name w:val="Quote Char"/>
-    <w:basedOn w:val="DefaultParagraphFont"/>
-    <w:link w:val="Quote"/>
+  <w:style w:type="character" w:customStyle="1" w:styleId="LitrichdnChar">
+    <w:name w:val="Lời trích dẫn Char"/>
+    <w:basedOn w:val="Phngmcinhcuaoanvn"/>
+    <w:link w:val="Litrichdn"/>
     <w:uiPriority w:val="29"/>
     <w:rsid w:val="002319D7"/>
     <w:rPr>
@@ -5090,9 +5228,9 @@
       <w:color w:val="404040" w:themeColor="text1" w:themeTint="BF"/>
     </w:rPr>
   </w:style>
-  <w:style w:type="paragraph" w:styleId="ListParagraph">
+  <w:style w:type="paragraph" w:styleId="oancuaDanhsach">
     <w:name w:val="List Paragraph"/>
-    <w:basedOn w:val="Normal"/>
+    <w:basedOn w:val="Binhthng"/>
     <w:uiPriority w:val="34"/>
     <w:qFormat/>
     <w:rsid w:val="002319D7"/>
@@ -5101,9 +5239,9 @@
       <w:contextualSpacing/>
     </w:pPr>
   </w:style>
-  <w:style w:type="character" w:styleId="IntenseEmphasis">
+  <w:style w:type="character" w:styleId="NhnmnhThm">
     <w:name w:val="Intense Emphasis"/>
-    <w:basedOn w:val="DefaultParagraphFont"/>
+    <w:basedOn w:val="Phngmcinhcuaoanvn"/>
     <w:uiPriority w:val="21"/>
     <w:qFormat/>
     <w:rsid w:val="002319D7"/>
@@ -5113,11 +5251,11 @@
       <w:color w:val="0F4761" w:themeColor="accent1" w:themeShade="BF"/>
     </w:rPr>
   </w:style>
-  <w:style w:type="paragraph" w:styleId="IntenseQuote">
+  <w:style w:type="paragraph" w:styleId="Nhaykepm">
     <w:name w:val="Intense Quote"/>
-    <w:basedOn w:val="Normal"/>
-    <w:next w:val="Normal"/>
-    <w:link w:val="IntenseQuoteChar"/>
+    <w:basedOn w:val="Binhthng"/>
+    <w:next w:val="Binhthng"/>
+    <w:link w:val="NhaykepmChar"/>
     <w:uiPriority w:val="30"/>
     <w:qFormat/>
     <w:rsid w:val="002319D7"/>
@@ -5136,10 +5274,10 @@
       <w:color w:val="0F4761" w:themeColor="accent1" w:themeShade="BF"/>
     </w:rPr>
   </w:style>
-  <w:style w:type="character" w:customStyle="1" w:styleId="IntenseQuoteChar">
-    <w:name w:val="Intense Quote Char"/>
-    <w:basedOn w:val="DefaultParagraphFont"/>
-    <w:link w:val="IntenseQuote"/>
+  <w:style w:type="character" w:customStyle="1" w:styleId="NhaykepmChar">
+    <w:name w:val="Nháy kép Đậm Char"/>
+    <w:basedOn w:val="Phngmcinhcuaoanvn"/>
+    <w:link w:val="Nhaykepm"/>
     <w:uiPriority w:val="30"/>
     <w:rsid w:val="002319D7"/>
     <w:rPr>
@@ -5148,9 +5286,9 @@
       <w:color w:val="0F4761" w:themeColor="accent1" w:themeShade="BF"/>
     </w:rPr>
   </w:style>
-  <w:style w:type="character" w:styleId="IntenseReference">
+  <w:style w:type="character" w:styleId="ThamchiuNhnmnh">
     <w:name w:val="Intense Reference"/>
-    <w:basedOn w:val="DefaultParagraphFont"/>
+    <w:basedOn w:val="Phngmcinhcuaoanvn"/>
     <w:uiPriority w:val="32"/>
     <w:qFormat/>
     <w:rsid w:val="002319D7"/>

</xml_diff>